<commit_message>
Bug Fix in GRN And PO report
</commit_message>
<xml_diff>
--- a/APLOS/POPResources/Templates/PurchaseOrder20204.docx
+++ b/APLOS/POPResources/Templates/PurchaseOrder20204.docx
@@ -4,6 +4,10 @@
   <w:body>
     <w:p>
       <w:pPr>
+        <w:tabs>
+          <w:tab w:val="left" w:pos="5109"/>
+        </w:tabs>
+        <w:ind w:left="1152" w:right="1152"/>
         <w:jc w:val="both"/>
         <w:rPr>
           <w:rFonts w:ascii="Arial Narrow" w:eastAsia="Arial" w:hAnsi="Arial Narrow" w:cs="Arial"/>
@@ -15,322 +19,11 @@
       </w:pPr>
       <w:r>
         <w:rPr>
-          <w:rFonts w:ascii="Arial Narrow" w:hAnsi="Arial Narrow" w:cs="Arial"/>
-          <w:noProof/>
-          <w:sz w:val="20"/>
-          <w:szCs w:val="20"/>
-        </w:rPr>
-        <mc:AlternateContent>
-          <mc:Choice Requires="wps">
-            <w:drawing>
-              <wp:anchor distT="45720" distB="45720" distL="114300" distR="114300" simplePos="0" relativeHeight="251662336" behindDoc="0" locked="0" layoutInCell="1" allowOverlap="1" wp14:anchorId="10CD9E97" wp14:editId="35333FC6">
-                <wp:simplePos x="0" y="0"/>
-                <wp:positionH relativeFrom="column">
-                  <wp:posOffset>209550</wp:posOffset>
-                </wp:positionH>
-                <wp:positionV relativeFrom="paragraph">
-                  <wp:posOffset>-66675</wp:posOffset>
-                </wp:positionV>
-                <wp:extent cx="2886075" cy="254635"/>
-                <wp:effectExtent l="0" t="0" r="0" b="0"/>
-                <wp:wrapSquare wrapText="bothSides"/>
-                <wp:docPr id="6" name="Text Box 2"/>
-                <wp:cNvGraphicFramePr>
-                  <a:graphicFrameLocks xmlns:a="http://schemas.openxmlformats.org/drawingml/2006/main"/>
-                </wp:cNvGraphicFramePr>
-                <a:graphic xmlns:a="http://schemas.openxmlformats.org/drawingml/2006/main">
-                  <a:graphicData uri="http://schemas.microsoft.com/office/word/2010/wordprocessingShape">
-                    <wps:wsp>
-                      <wps:cNvSpPr txBox="1">
-                        <a:spLocks noChangeArrowheads="1"/>
-                      </wps:cNvSpPr>
-                      <wps:spPr bwMode="auto">
-                        <a:xfrm>
-                          <a:off x="0" y="0"/>
-                          <a:ext cx="2886075" cy="254635"/>
-                        </a:xfrm>
-                        <a:prstGeom prst="rect">
-                          <a:avLst/>
-                        </a:prstGeom>
-                        <a:noFill/>
-                        <a:ln w="9525">
-                          <a:noFill/>
-                          <a:miter lim="800000"/>
-                          <a:headEnd/>
-                          <a:tailEnd/>
-                        </a:ln>
-                      </wps:spPr>
-                      <wps:txbx>
-                        <w:txbxContent>
-                          <w:p/>
-                        </w:txbxContent>
-                      </wps:txbx>
-                      <wps:bodyPr rot="0" vert="horz" wrap="square" lIns="91440" tIns="45720" rIns="91440" bIns="45720" anchor="t" anchorCtr="0">
-                        <a:noAutofit/>
-                      </wps:bodyPr>
-                    </wps:wsp>
-                  </a:graphicData>
-                </a:graphic>
-                <wp14:sizeRelH relativeFrom="margin">
-                  <wp14:pctWidth>0</wp14:pctWidth>
-                </wp14:sizeRelH>
-                <wp14:sizeRelV relativeFrom="margin">
-                  <wp14:pctHeight>0</wp14:pctHeight>
-                </wp14:sizeRelV>
-              </wp:anchor>
-            </w:drawing>
-          </mc:Choice>
-          <mc:Fallback>
-            <w:pict>
-              <v:shapetype w14:anchorId="10CD9E97" id="_x0000_t202" coordsize="21600,21600" o:spt="202" path="m,l,21600r21600,l21600,xe">
-                <v:stroke joinstyle="miter"/>
-                <v:path gradientshapeok="t" o:connecttype="rect"/>
-              </v:shapetype>
-              <v:shape id="Text Box 2" o:spid="_x0000_s1026" type="#_x0000_t202" style="position:absolute;left:0;text-align:left;margin-left:16.5pt;margin-top:-5.25pt;width:227.25pt;height:20.05pt;z-index:251662336;visibility:visible;mso-wrap-style:square;mso-width-percent:0;mso-height-percent:0;mso-wrap-distance-left:9pt;mso-wrap-distance-top:3.6pt;mso-wrap-distance-right:9pt;mso-wrap-distance-bottom:3.6pt;mso-position-horizontal:absolute;mso-position-horizontal-relative:text;mso-position-vertical:absolute;mso-position-vertical-relative:text;mso-width-percent:0;mso-height-percent:0;mso-width-relative:margin;mso-height-relative:margin;v-text-anchor:top" o:gfxdata="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" filled="f" stroked="f">
-                <v:textbox>
-                  <w:txbxContent>
-                    <w:p/>
-                  </w:txbxContent>
-                </v:textbox>
-                <w10:wrap type="square"/>
-              </v:shape>
-            </w:pict>
-          </mc:Fallback>
-        </mc:AlternateContent>
-      </w:r>
-    </w:p>
-    <w:p>
-      <w:pPr>
-        <w:jc w:val="both"/>
-        <w:rPr>
-          <w:rFonts w:ascii="Arial Narrow" w:hAnsi="Arial Narrow" w:cs="Arial"/>
-          <w:noProof/>
-          <w:sz w:val="20"/>
-          <w:szCs w:val="20"/>
-        </w:rPr>
-      </w:pPr>
-      <w:r>
-        <w:rPr>
-          <w:rFonts w:ascii="Arial Narrow" w:hAnsi="Arial Narrow" w:cs="Arial"/>
-          <w:noProof/>
-          <w:sz w:val="20"/>
-          <w:szCs w:val="20"/>
-        </w:rPr>
-        <mc:AlternateContent>
-          <mc:Choice Requires="wps">
-            <w:drawing>
-              <wp:anchor distT="0" distB="0" distL="114300" distR="114300" simplePos="0" relativeHeight="251682816" behindDoc="0" locked="0" layoutInCell="1" allowOverlap="1" wp14:anchorId="1C8DDD18" wp14:editId="65DD5812">
-                <wp:simplePos x="0" y="0"/>
-                <wp:positionH relativeFrom="column">
-                  <wp:posOffset>-3390900</wp:posOffset>
-                </wp:positionH>
-                <wp:positionV relativeFrom="paragraph">
-                  <wp:posOffset>22860</wp:posOffset>
-                </wp:positionV>
-                <wp:extent cx="3448050" cy="254635"/>
-                <wp:effectExtent l="0" t="0" r="0" b="0"/>
-                <wp:wrapNone/>
-                <wp:docPr id="4" name="Text Box 2"/>
-                <wp:cNvGraphicFramePr>
-                  <a:graphicFrameLocks xmlns:a="http://schemas.openxmlformats.org/drawingml/2006/main"/>
-                </wp:cNvGraphicFramePr>
-                <a:graphic xmlns:a="http://schemas.openxmlformats.org/drawingml/2006/main">
-                  <a:graphicData uri="http://schemas.microsoft.com/office/word/2010/wordprocessingShape">
-                    <wps:wsp>
-                      <wps:cNvSpPr txBox="1">
-                        <a:spLocks noChangeArrowheads="1"/>
-                      </wps:cNvSpPr>
-                      <wps:spPr bwMode="auto">
-                        <a:xfrm>
-                          <a:off x="0" y="0"/>
-                          <a:ext cx="3448050" cy="254635"/>
-                        </a:xfrm>
-                        <a:prstGeom prst="rect">
-                          <a:avLst/>
-                        </a:prstGeom>
-                        <a:noFill/>
-                        <a:ln w="9525">
-                          <a:noFill/>
-                          <a:miter lim="800000"/>
-                          <a:headEnd/>
-                          <a:tailEnd/>
-                        </a:ln>
-                      </wps:spPr>
-                      <wps:txbx>
-                        <w:txbxContent>
-                          <w:p>
-                            <w:pPr>
-                              <w:rPr>
-                                <w:rFonts w:ascii="Times New Roman" w:hAnsi="Times New Roman" w:cs="Times New Roman"/>
-                                <w:b/>
-                                <w:bCs/>
-                                <w:sz w:val="20"/>
-                                <w:szCs w:val="20"/>
-                                <w:u w:val="thick"/>
-                              </w:rPr>
-                            </w:pPr>
-                            <w:r>
-                              <w:rPr>
-                                <w:rFonts w:ascii="Times New Roman" w:hAnsi="Times New Roman" w:cs="Times New Roman"/>
-                                <w:b/>
-                                <w:bCs/>
-                                <w:sz w:val="20"/>
-                                <w:szCs w:val="20"/>
-                                <w:u w:val="thick"/>
-                              </w:rPr>
-                              <w:t xml:space="preserve">PURCHASE </w:t>
-                            </w:r>
-                            <w:r>
-                              <w:rPr>
-                                <w:rFonts w:ascii="Times New Roman" w:hAnsi="Times New Roman" w:cs="Times New Roman"/>
-                                <w:b/>
-                                <w:bCs/>
-                                <w:sz w:val="20"/>
-                                <w:szCs w:val="20"/>
-                                <w:u w:val="thick"/>
-                              </w:rPr>
-                              <w:t>ORDER</w:t>
-                            </w:r>
-                          </w:p>
-                          <w:p>
-                            <w:pPr>
-                              <w:jc w:val="center"/>
-                              <w:rPr>
-                                <w:rFonts w:ascii="Times New Roman" w:hAnsi="Times New Roman" w:cs="Times New Roman"/>
-                                <w:b/>
-                                <w:bCs/>
-                              </w:rPr>
-                            </w:pPr>
-                          </w:p>
-                          <w:p>
-                            <w:pPr>
-                              <w:jc w:val="center"/>
-                              <w:rPr>
-                                <w:rFonts w:ascii="Times New Roman" w:hAnsi="Times New Roman" w:cs="Times New Roman"/>
-                                <w:b/>
-                                <w:bCs/>
-                              </w:rPr>
-                            </w:pPr>
-                          </w:p>
-                          <w:p>
-                            <w:pPr>
-                              <w:jc w:val="center"/>
-                              <w:rPr>
-                                <w:rFonts w:ascii="Times New Roman" w:hAnsi="Times New Roman" w:cs="Times New Roman"/>
-                              </w:rPr>
-                            </w:pPr>
-                          </w:p>
-                        </w:txbxContent>
-                      </wps:txbx>
-                      <wps:bodyPr rot="0" vert="horz" wrap="square" lIns="91440" tIns="45720" rIns="91440" bIns="45720" anchor="t" anchorCtr="0">
-                        <a:noAutofit/>
-                      </wps:bodyPr>
-                    </wps:wsp>
-                  </a:graphicData>
-                </a:graphic>
-              </wp:anchor>
-            </w:drawing>
-          </mc:Choice>
-          <mc:Fallback>
-            <w:pict>
-              <v:shape w14:anchorId="1C8DDD18" id="_x0000_s1027" type="#_x0000_t202" style="position:absolute;left:0;text-align:left;margin-left:-267pt;margin-top:1.8pt;width:271.5pt;height:20.05pt;z-index:251682816;visibility:visible;mso-wrap-style:square;mso-wrap-distance-left:9pt;mso-wrap-distance-top:0;mso-wrap-distance-right:9pt;mso-wrap-distance-bottom:0;mso-position-horizontal:absolute;mso-position-horizontal-relative:text;mso-position-vertical:absolute;mso-position-vertical-relative:text;v-text-anchor:top" o:gfxdata="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" filled="f" stroked="f">
-                <v:textbox>
-                  <w:txbxContent>
-                    <w:p>
-                      <w:pPr>
-                        <w:rPr>
-                          <w:rFonts w:ascii="Times New Roman" w:hAnsi="Times New Roman" w:cs="Times New Roman"/>
-                          <w:b/>
-                          <w:bCs/>
-                          <w:sz w:val="20"/>
-                          <w:szCs w:val="20"/>
-                          <w:u w:val="thick"/>
-                        </w:rPr>
-                      </w:pPr>
-                      <w:r>
-                        <w:rPr>
-                          <w:rFonts w:ascii="Times New Roman" w:hAnsi="Times New Roman" w:cs="Times New Roman"/>
-                          <w:b/>
-                          <w:bCs/>
-                          <w:sz w:val="20"/>
-                          <w:szCs w:val="20"/>
-                          <w:u w:val="thick"/>
-                        </w:rPr>
-                        <w:t xml:space="preserve">PURCHASE </w:t>
-                      </w:r>
-                      <w:r>
-                        <w:rPr>
-                          <w:rFonts w:ascii="Times New Roman" w:hAnsi="Times New Roman" w:cs="Times New Roman"/>
-                          <w:b/>
-                          <w:bCs/>
-                          <w:sz w:val="20"/>
-                          <w:szCs w:val="20"/>
-                          <w:u w:val="thick"/>
-                        </w:rPr>
-                        <w:t>ORDER</w:t>
-                      </w:r>
-                    </w:p>
-                    <w:p>
-                      <w:pPr>
-                        <w:jc w:val="center"/>
-                        <w:rPr>
-                          <w:rFonts w:ascii="Times New Roman" w:hAnsi="Times New Roman" w:cs="Times New Roman"/>
-                          <w:b/>
-                          <w:bCs/>
-                        </w:rPr>
-                      </w:pPr>
-                    </w:p>
-                    <w:p>
-                      <w:pPr>
-                        <w:jc w:val="center"/>
-                        <w:rPr>
-                          <w:rFonts w:ascii="Times New Roman" w:hAnsi="Times New Roman" w:cs="Times New Roman"/>
-                          <w:b/>
-                          <w:bCs/>
-                        </w:rPr>
-                      </w:pPr>
-                    </w:p>
-                    <w:p>
-                      <w:pPr>
-                        <w:jc w:val="center"/>
-                        <w:rPr>
-                          <w:rFonts w:ascii="Times New Roman" w:hAnsi="Times New Roman" w:cs="Times New Roman"/>
-                        </w:rPr>
-                      </w:pPr>
-                    </w:p>
-                  </w:txbxContent>
-                </v:textbox>
-              </v:shape>
-            </w:pict>
-          </mc:Fallback>
-        </mc:AlternateContent>
-      </w:r>
-    </w:p>
-    <w:p>
-      <w:pPr>
-        <w:tabs>
-          <w:tab w:val="left" w:pos="3525"/>
-          <w:tab w:val="left" w:pos="8580"/>
-        </w:tabs>
-        <w:rPr>
-          <w:rFonts w:ascii="Arial Narrow" w:hAnsi="Arial Narrow" w:cs="Arial"/>
-          <w:sz w:val="20"/>
-          <w:szCs w:val="20"/>
-        </w:rPr>
-      </w:pPr>
-      <w:r>
-        <w:rPr>
-          <w:rFonts w:ascii="Arial Narrow" w:hAnsi="Arial Narrow" w:cs="Arial"/>
-          <w:sz w:val="20"/>
-          <w:szCs w:val="20"/>
-        </w:rPr>
-        <w:tab/>
-      </w:r>
-      <w:r>
-        <w:rPr>
-          <w:rFonts w:ascii="Arial Narrow" w:hAnsi="Arial Narrow" w:cs="Arial"/>
-          <w:sz w:val="20"/>
-          <w:szCs w:val="20"/>
+          <w:rFonts w:ascii="Arial Narrow" w:eastAsia="Arial" w:hAnsi="Arial Narrow" w:cs="Arial"/>
+          <w:b/>
+          <w:bCs/>
+          <w:sz w:val="23"/>
+          <w:szCs w:val="23"/>
         </w:rPr>
         <w:tab/>
       </w:r>
@@ -338,30 +31,30 @@
     <w:tbl>
       <w:tblPr>
         <w:tblStyle w:val="TableGrid"/>
-        <w:tblpPr w:leftFromText="180" w:rightFromText="180" w:vertAnchor="page" w:horzAnchor="margin" w:tblpXSpec="center" w:tblpY="2476"/>
-        <w:tblW w:w="16848" w:type="dxa"/>
+        <w:tblpPr w:leftFromText="180" w:rightFromText="180" w:vertAnchor="page" w:horzAnchor="margin" w:tblpXSpec="center" w:tblpY="1831"/>
+        <w:tblW w:w="18108" w:type="dxa"/>
         <w:tblLayout w:type="fixed"/>
         <w:tblLook w:val="04A0" w:firstRow="1" w:lastRow="0" w:firstColumn="1" w:lastColumn="0" w:noHBand="0" w:noVBand="1"/>
       </w:tblPr>
       <w:tblGrid>
-        <w:gridCol w:w="5816"/>
-        <w:gridCol w:w="2851"/>
-        <w:gridCol w:w="8181"/>
+        <w:gridCol w:w="3168"/>
+        <w:gridCol w:w="1710"/>
+        <w:gridCol w:w="13230"/>
       </w:tblGrid>
       <w:tr>
         <w:trPr>
-          <w:trHeight w:val="361"/>
+          <w:trHeight w:val="620"/>
         </w:trPr>
         <w:tc>
           <w:tcPr>
-            <w:tcW w:w="5816" w:type="dxa"/>
+            <w:tcW w:w="3168" w:type="dxa"/>
           </w:tcPr>
           <w:p>
             <w:pPr>
               <w:rPr>
-                <w:rFonts w:ascii="Tahoma" w:eastAsia="Arial" w:hAnsi="Tahoma" w:cs="Tahoma"/>
-                <w:b/>
-                <w:bCs/>
+                <w:rFonts w:ascii="Tahoma" w:eastAsia="Times New Roman" w:hAnsi="Tahoma" w:cs="Tahoma"/>
+                <w:b/>
+                <w:color w:val="000000"/>
                 <w:sz w:val="16"/>
                 <w:szCs w:val="16"/>
               </w:rPr>
@@ -390,6 +83,7 @@
             <w:r>
               <w:rPr>
                 <w:rFonts w:ascii="Tahoma" w:eastAsia="Times New Roman" w:hAnsi="Tahoma" w:cs="Tahoma"/>
+                <w:b/>
                 <w:color w:val="000000"/>
                 <w:sz w:val="16"/>
                 <w:szCs w:val="16"/>
@@ -411,22 +105,22 @@
           <w:p>
             <w:pPr>
               <w:rPr>
-                <w:rFonts w:ascii="Tahoma" w:eastAsia="Arial" w:hAnsi="Tahoma" w:cs="Tahoma"/>
-                <w:b/>
-                <w:bCs/>
+                <w:rFonts w:ascii="Tahoma" w:eastAsia="Times New Roman" w:hAnsi="Tahoma" w:cs="Tahoma"/>
+                <w:b/>
+                <w:color w:val="000000"/>
                 <w:sz w:val="16"/>
                 <w:szCs w:val="16"/>
               </w:rPr>
             </w:pPr>
             <w:r>
               <w:rPr>
-                <w:rFonts w:ascii="Tahoma" w:eastAsia="Arial" w:hAnsi="Tahoma" w:cs="Tahoma"/>
-                <w:b/>
-                <w:bCs/>
-                <w:sz w:val="16"/>
-                <w:szCs w:val="16"/>
-              </w:rPr>
-              <w:t>Contract No: {}                        Purchase LC No: {</w:t>
+                <w:rFonts w:ascii="Tahoma" w:eastAsia="Times New Roman" w:hAnsi="Tahoma" w:cs="Tahoma"/>
+                <w:b/>
+                <w:color w:val="000000"/>
+                <w:sz w:val="16"/>
+                <w:szCs w:val="16"/>
+              </w:rPr>
+              <w:t>Contract No: {</w:t>
             </w:r>
             <w:proofErr w:type="spellStart"/>
             <w:r>
@@ -437,14 +131,23 @@
                 <w:szCs w:val="16"/>
                 <w:highlight w:val="white"/>
               </w:rPr>
-              <w:t>PurchaseLCId</w:t>
+              <w:t>Contract</w:t>
+            </w:r>
+            <w:r>
+              <w:rPr>
+                <w:rFonts w:ascii="Tahoma" w:hAnsi="Tahoma" w:cs="Tahoma"/>
+                <w:color w:val="000000"/>
+                <w:sz w:val="16"/>
+                <w:szCs w:val="16"/>
+              </w:rPr>
+              <w:t>No</w:t>
             </w:r>
             <w:proofErr w:type="spellEnd"/>
             <w:r>
               <w:rPr>
-                <w:rFonts w:ascii="Tahoma" w:eastAsia="Arial" w:hAnsi="Tahoma" w:cs="Tahoma"/>
-                <w:b/>
-                <w:bCs/>
+                <w:rFonts w:ascii="Tahoma" w:eastAsia="Times New Roman" w:hAnsi="Tahoma" w:cs="Tahoma"/>
+                <w:b/>
+                <w:color w:val="000000"/>
                 <w:sz w:val="16"/>
                 <w:szCs w:val="16"/>
               </w:rPr>
@@ -455,44 +158,121 @@
             <w:pPr>
               <w:rPr>
                 <w:rFonts w:ascii="Tahoma" w:hAnsi="Tahoma" w:cs="Tahoma"/>
+                <w:color w:val="000000"/>
                 <w:sz w:val="16"/>
                 <w:szCs w:val="16"/>
               </w:rPr>
             </w:pPr>
+            <w:r>
+              <w:rPr>
+                <w:rFonts w:ascii="Tahoma" w:eastAsia="Times New Roman" w:hAnsi="Tahoma" w:cs="Tahoma"/>
+                <w:b/>
+                <w:color w:val="000000"/>
+                <w:sz w:val="16"/>
+                <w:szCs w:val="16"/>
+              </w:rPr>
+              <w:t xml:space="preserve">Style: </w:t>
+            </w:r>
+            <w:r>
+              <w:rPr>
+                <w:rFonts w:ascii="Tahoma" w:eastAsia="Times New Roman" w:hAnsi="Tahoma" w:cs="Tahoma"/>
+                <w:b/>
+                <w:color w:val="000000"/>
+                <w:sz w:val="16"/>
+                <w:szCs w:val="16"/>
+              </w:rPr>
+              <w:t>{</w:t>
+            </w:r>
+            <w:proofErr w:type="spellStart"/>
+            <w:r>
+              <w:rPr>
+                <w:rFonts w:ascii="Tahoma" w:eastAsia="Times New Roman" w:hAnsi="Tahoma" w:cs="Tahoma"/>
+                <w:b/>
+                <w:color w:val="000000"/>
+                <w:sz w:val="16"/>
+                <w:szCs w:val="16"/>
+              </w:rPr>
+              <w:t>BuyerReferenceNo</w:t>
+            </w:r>
+            <w:proofErr w:type="spellEnd"/>
+            <w:r>
+              <w:rPr>
+                <w:rFonts w:ascii="Tahoma" w:eastAsia="Times New Roman" w:hAnsi="Tahoma" w:cs="Tahoma"/>
+                <w:b/>
+                <w:color w:val="000000"/>
+                <w:sz w:val="16"/>
+                <w:szCs w:val="16"/>
+              </w:rPr>
+              <w:t>}</w:t>
+            </w:r>
+          </w:p>
+          <w:p>
+            <w:pPr>
+              <w:rPr>
+                <w:rFonts w:ascii="Tahoma" w:eastAsia="Times New Roman" w:hAnsi="Tahoma" w:cs="Tahoma"/>
+                <w:b/>
+                <w:color w:val="000000"/>
+                <w:sz w:val="16"/>
+                <w:szCs w:val="16"/>
+              </w:rPr>
+            </w:pPr>
+            <w:r>
+              <w:rPr>
+                <w:rFonts w:ascii="Tahoma" w:eastAsia="Times New Roman" w:hAnsi="Tahoma" w:cs="Tahoma"/>
+                <w:b/>
+                <w:color w:val="000000"/>
+                <w:sz w:val="16"/>
+                <w:szCs w:val="16"/>
+              </w:rPr>
+              <w:t>Purchase LC NO: {</w:t>
+            </w:r>
+            <w:proofErr w:type="spellStart"/>
+            <w:r>
+              <w:rPr>
+                <w:rFonts w:ascii="Tahoma" w:hAnsi="Tahoma" w:cs="Tahoma"/>
+                <w:color w:val="000000"/>
+                <w:sz w:val="16"/>
+                <w:szCs w:val="16"/>
+                <w:highlight w:val="white"/>
+              </w:rPr>
+              <w:t>PurchaseLCId</w:t>
+            </w:r>
+            <w:proofErr w:type="spellEnd"/>
+            <w:r>
+              <w:rPr>
+                <w:rFonts w:ascii="Tahoma" w:eastAsia="Times New Roman" w:hAnsi="Tahoma" w:cs="Tahoma"/>
+                <w:b/>
+                <w:color w:val="000000"/>
+                <w:sz w:val="16"/>
+                <w:szCs w:val="16"/>
+              </w:rPr>
+              <w:t>}</w:t>
+            </w:r>
           </w:p>
         </w:tc>
         <w:tc>
           <w:tcPr>
-            <w:tcW w:w="2851" w:type="dxa"/>
+            <w:tcW w:w="1710" w:type="dxa"/>
           </w:tcPr>
           <w:p>
             <w:pPr>
               <w:rPr>
-                <w:rFonts w:ascii="Tahoma" w:hAnsi="Tahoma" w:cs="Tahoma"/>
-                <w:sz w:val="16"/>
-                <w:szCs w:val="16"/>
-              </w:rPr>
-            </w:pPr>
-            <w:r>
-              <w:rPr>
-                <w:rFonts w:ascii="Tahoma" w:eastAsia="Arial" w:hAnsi="Tahoma" w:cs="Tahoma"/>
-                <w:b/>
-                <w:bCs/>
-                <w:sz w:val="16"/>
-                <w:szCs w:val="16"/>
-              </w:rPr>
-              <w:t xml:space="preserve">Dated:  </w:t>
-            </w:r>
-            <w:r>
-              <w:rPr>
                 <w:rFonts w:ascii="Tahoma" w:eastAsia="Times New Roman" w:hAnsi="Tahoma" w:cs="Tahoma"/>
                 <w:color w:val="000000"/>
                 <w:sz w:val="16"/>
                 <w:szCs w:val="16"/>
               </w:rPr>
-              <w:t>{</w:t>
-            </w:r>
-            <w:proofErr w:type="spellStart"/>
+            </w:pPr>
+            <w:r>
+              <w:rPr>
+                <w:rFonts w:ascii="Tahoma" w:eastAsia="Arial" w:hAnsi="Tahoma" w:cs="Tahoma"/>
+                <w:b/>
+                <w:bCs/>
+                <w:sz w:val="16"/>
+                <w:szCs w:val="16"/>
+              </w:rPr>
+              <w:t xml:space="preserve">Dated: </w:t>
+            </w:r>
             <w:r>
               <w:rPr>
                 <w:rFonts w:ascii="Tahoma" w:eastAsia="Times New Roman" w:hAnsi="Tahoma" w:cs="Tahoma"/>
@@ -500,9 +280,9 @@
                 <w:sz w:val="16"/>
                 <w:szCs w:val="16"/>
               </w:rPr>
-              <w:t>PODate</w:t>
-            </w:r>
-            <w:proofErr w:type="spellEnd"/>
+              <w:t>{</w:t>
+            </w:r>
+            <w:proofErr w:type="spellStart"/>
             <w:r>
               <w:rPr>
                 <w:rFonts w:ascii="Tahoma" w:eastAsia="Times New Roman" w:hAnsi="Tahoma" w:cs="Tahoma"/>
@@ -510,13 +290,76 @@
                 <w:sz w:val="16"/>
                 <w:szCs w:val="16"/>
               </w:rPr>
+              <w:t>PODate</w:t>
+            </w:r>
+            <w:proofErr w:type="spellEnd"/>
+            <w:r>
+              <w:rPr>
+                <w:rFonts w:ascii="Tahoma" w:eastAsia="Times New Roman" w:hAnsi="Tahoma" w:cs="Tahoma"/>
+                <w:color w:val="000000"/>
+                <w:sz w:val="16"/>
+                <w:szCs w:val="16"/>
+              </w:rPr>
               <w:t xml:space="preserve">} </w:t>
+            </w:r>
+          </w:p>
+          <w:p>
+            <w:pPr>
+              <w:rPr>
+                <w:rFonts w:ascii="Tahoma" w:hAnsi="Tahoma" w:cs="Tahoma"/>
+                <w:sz w:val="16"/>
+                <w:szCs w:val="16"/>
+              </w:rPr>
+            </w:pPr>
+            <w:proofErr w:type="spellStart"/>
+            <w:r>
+              <w:rPr>
+                <w:rFonts w:ascii="Tahoma" w:hAnsi="Tahoma" w:cs="Tahoma"/>
+                <w:b/>
+                <w:color w:val="000000"/>
+                <w:sz w:val="16"/>
+                <w:szCs w:val="16"/>
+                <w:highlight w:val="white"/>
+              </w:rPr>
+              <w:t>POType</w:t>
+            </w:r>
+            <w:proofErr w:type="spellEnd"/>
+            <w:r>
+              <w:rPr>
+                <w:rFonts w:ascii="Tahoma" w:hAnsi="Tahoma" w:cs="Tahoma"/>
+                <w:color w:val="000000"/>
+                <w:sz w:val="16"/>
+                <w:szCs w:val="16"/>
+              </w:rPr>
+              <w:t>: {</w:t>
+            </w:r>
+            <w:proofErr w:type="spellStart"/>
+            <w:r>
+              <w:rPr>
+                <w:rFonts w:ascii="Tahoma" w:hAnsi="Tahoma" w:cs="Tahoma"/>
+                <w:b/>
+                <w:color w:val="000000"/>
+                <w:sz w:val="16"/>
+                <w:szCs w:val="16"/>
+                <w:highlight w:val="white"/>
+              </w:rPr>
+              <w:t>POType</w:t>
+            </w:r>
+            <w:proofErr w:type="spellEnd"/>
+            <w:r>
+              <w:rPr>
+                <w:rFonts w:ascii="Tahoma" w:hAnsi="Tahoma" w:cs="Tahoma"/>
+                <w:color w:val="000000"/>
+                <w:sz w:val="16"/>
+                <w:szCs w:val="16"/>
+              </w:rPr>
+              <w:t>}</w:t>
             </w:r>
           </w:p>
         </w:tc>
         <w:tc>
           <w:tcPr>
-            <w:tcW w:w="8181" w:type="dxa"/>
+            <w:tcW w:w="13230" w:type="dxa"/>
           </w:tcPr>
           <w:p>
             <w:pPr>
@@ -526,6 +369,7 @@
                 <w:szCs w:val="16"/>
               </w:rPr>
             </w:pPr>
+            <w:proofErr w:type="gramStart"/>
             <w:r>
               <w:rPr>
                 <w:rFonts w:ascii="Tahoma" w:hAnsi="Tahoma" w:cs="Tahoma"/>
@@ -533,7 +377,17 @@
                 <w:sz w:val="16"/>
                 <w:szCs w:val="16"/>
               </w:rPr>
-              <w:t>Checked  Status:</w:t>
+              <w:t>Checked  Status</w:t>
+            </w:r>
+            <w:proofErr w:type="gramEnd"/>
+            <w:r>
+              <w:rPr>
+                <w:rFonts w:ascii="Tahoma" w:hAnsi="Tahoma" w:cs="Tahoma"/>
+                <w:b/>
+                <w:sz w:val="16"/>
+                <w:szCs w:val="16"/>
+              </w:rPr>
+              <w:t>:</w:t>
             </w:r>
             <w:r>
               <w:rPr>
@@ -642,11 +496,11 @@
       </w:tr>
       <w:tr>
         <w:trPr>
-          <w:trHeight w:val="710"/>
+          <w:trHeight w:val="440"/>
         </w:trPr>
         <w:tc>
           <w:tcPr>
-            <w:tcW w:w="5816" w:type="dxa"/>
+            <w:tcW w:w="3168" w:type="dxa"/>
           </w:tcPr>
           <w:p>
             <w:pPr>
@@ -677,6 +531,7 @@
               </w:rPr>
               <w:t>{</w:t>
             </w:r>
+            <w:proofErr w:type="spellStart"/>
             <w:r>
               <w:rPr>
                 <w:rFonts w:ascii="Tahoma" w:eastAsia="Times New Roman" w:hAnsi="Tahoma" w:cs="Tahoma"/>
@@ -687,6 +542,7 @@
               </w:rPr>
               <w:t>VendorName</w:t>
             </w:r>
+            <w:proofErr w:type="spellEnd"/>
             <w:r>
               <w:rPr>
                 <w:rFonts w:ascii="Tahoma" w:eastAsia="Times New Roman" w:hAnsi="Tahoma" w:cs="Tahoma"/>
@@ -747,20 +603,11 @@
               </w:rPr>
               <w:t>}</w:t>
             </w:r>
-          </w:p>
-          <w:p>
-            <w:pPr>
-              <w:rPr>
-                <w:rFonts w:ascii="Tahoma" w:hAnsi="Tahoma" w:cs="Tahoma"/>
-                <w:sz w:val="16"/>
-                <w:szCs w:val="16"/>
-              </w:rPr>
-            </w:pPr>
           </w:p>
         </w:tc>
         <w:tc>
           <w:tcPr>
-            <w:tcW w:w="11032" w:type="dxa"/>
+            <w:tcW w:w="14940" w:type="dxa"/>
             <w:gridSpan w:val="2"/>
           </w:tcPr>
           <w:p>
@@ -792,6 +639,7 @@
               </w:rPr>
               <w:t>{</w:t>
             </w:r>
+            <w:proofErr w:type="spellStart"/>
             <w:r>
               <w:rPr>
                 <w:rFonts w:ascii="Tahoma" w:eastAsia="Times New Roman" w:hAnsi="Tahoma" w:cs="Tahoma"/>
@@ -802,6 +650,7 @@
               </w:rPr>
               <w:t>InvoicingPartyName</w:t>
             </w:r>
+            <w:proofErr w:type="spellEnd"/>
             <w:r>
               <w:rPr>
                 <w:rFonts w:ascii="Tahoma" w:eastAsia="Times New Roman" w:hAnsi="Tahoma" w:cs="Tahoma"/>
@@ -876,11 +725,11 @@
       </w:tr>
       <w:tr>
         <w:trPr>
-          <w:trHeight w:val="186"/>
+          <w:trHeight w:val="154"/>
         </w:trPr>
         <w:tc>
           <w:tcPr>
-            <w:tcW w:w="5816" w:type="dxa"/>
+            <w:tcW w:w="3168" w:type="dxa"/>
           </w:tcPr>
           <w:p>
             <w:pPr>
@@ -900,9 +749,21 @@
                 <w:sz w:val="16"/>
                 <w:szCs w:val="16"/>
               </w:rPr>
-              <w:t>Your Ref No.:{</w:t>
+              <w:t xml:space="preserve">Your Ref </w:t>
+            </w:r>
+            <w:proofErr w:type="gramStart"/>
+            <w:r>
+              <w:rPr>
+                <w:rFonts w:ascii="Tahoma" w:eastAsia="Arial" w:hAnsi="Tahoma" w:cs="Tahoma"/>
+                <w:b/>
+                <w:bCs/>
+                <w:sz w:val="16"/>
+                <w:szCs w:val="16"/>
+              </w:rPr>
+              <w:t>No.:{</w:t>
             </w:r>
             <w:proofErr w:type="spellStart"/>
+            <w:proofErr w:type="gramEnd"/>
             <w:r>
               <w:rPr>
                 <w:rFonts w:ascii="Tahoma" w:eastAsia="Arial" w:hAnsi="Tahoma" w:cs="Tahoma"/>
@@ -927,7 +788,7 @@
         </w:tc>
         <w:tc>
           <w:tcPr>
-            <w:tcW w:w="11032" w:type="dxa"/>
+            <w:tcW w:w="14940" w:type="dxa"/>
             <w:gridSpan w:val="2"/>
           </w:tcPr>
           <w:p>
@@ -951,9 +812,21 @@
                 <w:sz w:val="16"/>
                 <w:szCs w:val="16"/>
               </w:rPr>
-              <w:t>Your Ref Date:{</w:t>
+              <w:t xml:space="preserve">Your Ref </w:t>
+            </w:r>
+            <w:proofErr w:type="gramStart"/>
+            <w:r>
+              <w:rPr>
+                <w:rFonts w:ascii="Tahoma" w:eastAsia="Arial" w:hAnsi="Tahoma" w:cs="Tahoma"/>
+                <w:b/>
+                <w:bCs/>
+                <w:sz w:val="16"/>
+                <w:szCs w:val="16"/>
+              </w:rPr>
+              <w:t>Date:{</w:t>
             </w:r>
             <w:proofErr w:type="spellStart"/>
+            <w:proofErr w:type="gramEnd"/>
             <w:r>
               <w:rPr>
                 <w:rFonts w:ascii="Tahoma" w:eastAsia="Arial" w:hAnsi="Tahoma" w:cs="Tahoma"/>
@@ -979,11 +852,11 @@
       </w:tr>
       <w:tr>
         <w:trPr>
-          <w:trHeight w:val="472"/>
+          <w:trHeight w:val="391"/>
         </w:trPr>
         <w:tc>
           <w:tcPr>
-            <w:tcW w:w="16848" w:type="dxa"/>
+            <w:tcW w:w="18108" w:type="dxa"/>
             <w:gridSpan w:val="3"/>
             <w:tcBorders>
               <w:left w:val="single" w:sz="4" w:space="0" w:color="auto"/>
@@ -1046,11 +919,11 @@
           <w:tblLook w:val="0000" w:firstRow="0" w:lastRow="0" w:firstColumn="0" w:lastColumn="0" w:noHBand="0" w:noVBand="0"/>
         </w:tblPrEx>
         <w:trPr>
-          <w:trHeight w:val="450"/>
+          <w:trHeight w:val="372"/>
         </w:trPr>
         <w:tc>
           <w:tcPr>
-            <w:tcW w:w="16848" w:type="dxa"/>
+            <w:tcW w:w="18108" w:type="dxa"/>
             <w:gridSpan w:val="3"/>
             <w:tcBorders>
               <w:left w:val="single" w:sz="4" w:space="0" w:color="auto"/>
@@ -1059,18 +932,6 @@
           </w:tcPr>
           <w:p>
             <w:pPr>
-              <w:jc w:val="center"/>
-              <w:rPr>
-                <w:rFonts w:ascii="Tahoma" w:eastAsia="Arial" w:hAnsi="Tahoma" w:cs="Tahoma"/>
-                <w:b/>
-                <w:bCs/>
-                <w:sz w:val="16"/>
-                <w:szCs w:val="16"/>
-              </w:rPr>
-            </w:pPr>
-          </w:p>
-          <w:p>
-            <w:pPr>
               <w:rPr>
                 <w:rFonts w:ascii="Tahoma" w:eastAsia="Arial" w:hAnsi="Tahoma" w:cs="Tahoma"/>
                 <w:b/>
@@ -1141,11 +1002,11 @@
           <w:tblLook w:val="0000" w:firstRow="0" w:lastRow="0" w:firstColumn="0" w:lastColumn="0" w:noHBand="0" w:noVBand="0"/>
         </w:tblPrEx>
         <w:trPr>
-          <w:trHeight w:val="1085"/>
+          <w:trHeight w:val="998"/>
         </w:trPr>
         <w:tc>
           <w:tcPr>
-            <w:tcW w:w="16848" w:type="dxa"/>
+            <w:tcW w:w="18108" w:type="dxa"/>
             <w:gridSpan w:val="3"/>
             <w:tcBorders>
               <w:left w:val="single" w:sz="4" w:space="0" w:color="auto"/>
@@ -1153,7 +1014,92 @@
           </w:tcPr>
           <w:p>
             <w:pPr>
-              <w:jc w:val="center"/>
+              <w:rPr>
+                <w:rFonts w:ascii="Tahoma" w:eastAsia="Arial" w:hAnsi="Tahoma" w:cs="Tahoma"/>
+                <w:b/>
+                <w:bCs/>
+                <w:sz w:val="16"/>
+                <w:szCs w:val="16"/>
+              </w:rPr>
+            </w:pPr>
+            <w:r>
+              <w:rPr>
+                <w:rFonts w:ascii="Tahoma" w:eastAsia="Arial" w:hAnsi="Tahoma" w:cs="Tahoma"/>
+                <w:b/>
+                <w:bCs/>
+                <w:sz w:val="16"/>
+                <w:szCs w:val="16"/>
+              </w:rPr>
+              <w:t>{</w:t>
+            </w:r>
+            <w:proofErr w:type="spellStart"/>
+            <w:r>
+              <w:rPr>
+                <w:rFonts w:ascii="Tahoma" w:eastAsia="Arial" w:hAnsi="Tahoma" w:cs="Tahoma"/>
+                <w:b/>
+                <w:bCs/>
+                <w:sz w:val="16"/>
+                <w:szCs w:val="16"/>
+              </w:rPr>
+              <w:t>ServiceDetails</w:t>
+            </w:r>
+            <w:proofErr w:type="spellEnd"/>
+            <w:r>
+              <w:rPr>
+                <w:rFonts w:ascii="Tahoma" w:eastAsia="Arial" w:hAnsi="Tahoma" w:cs="Tahoma"/>
+                <w:b/>
+                <w:bCs/>
+                <w:sz w:val="16"/>
+                <w:szCs w:val="16"/>
+              </w:rPr>
+              <w:t>}</w:t>
+            </w:r>
+          </w:p>
+          <w:p>
+            <w:pPr>
+              <w:rPr>
+                <w:rFonts w:ascii="Tahoma" w:eastAsia="Arial" w:hAnsi="Tahoma" w:cs="Tahoma"/>
+                <w:b/>
+                <w:bCs/>
+                <w:sz w:val="16"/>
+                <w:szCs w:val="16"/>
+              </w:rPr>
+            </w:pPr>
+            <w:r>
+              <w:rPr>
+                <w:rFonts w:ascii="Tahoma" w:eastAsia="Arial" w:hAnsi="Tahoma" w:cs="Tahoma"/>
+                <w:b/>
+                <w:bCs/>
+                <w:sz w:val="16"/>
+                <w:szCs w:val="16"/>
+              </w:rPr>
+              <w:t>{</w:t>
+            </w:r>
+            <w:proofErr w:type="spellStart"/>
+            <w:r>
+              <w:rPr>
+                <w:rFonts w:ascii="Tahoma" w:eastAsia="Arial" w:hAnsi="Tahoma" w:cs="Tahoma"/>
+                <w:b/>
+                <w:bCs/>
+                <w:sz w:val="16"/>
+                <w:szCs w:val="16"/>
+              </w:rPr>
+              <w:t>ServiceItems</w:t>
+            </w:r>
+            <w:proofErr w:type="spellEnd"/>
+            <w:r>
+              <w:rPr>
+                <w:rFonts w:ascii="Tahoma" w:eastAsia="Arial" w:hAnsi="Tahoma" w:cs="Tahoma"/>
+                <w:b/>
+                <w:bCs/>
+                <w:sz w:val="16"/>
+                <w:szCs w:val="16"/>
+              </w:rPr>
+              <w:t>}</w:t>
+            </w:r>
+          </w:p>
+          <w:p>
+            <w:pPr>
               <w:rPr>
                 <w:rFonts w:ascii="Tahoma" w:eastAsia="Arial" w:hAnsi="Tahoma" w:cs="Tahoma"/>
                 <w:b/>
@@ -1173,15 +1119,27 @@
                 <w:szCs w:val="16"/>
               </w:rPr>
             </w:pPr>
-            <w:r>
-              <w:rPr>
-                <w:rFonts w:ascii="Tahoma" w:eastAsia="Arial" w:hAnsi="Tahoma" w:cs="Tahoma"/>
-                <w:b/>
-                <w:bCs/>
-                <w:sz w:val="16"/>
-                <w:szCs w:val="16"/>
-              </w:rPr>
-              <w:t>{</w:t>
+            <w:proofErr w:type="gramStart"/>
+            <w:r>
+              <w:rPr>
+                <w:rFonts w:ascii="Tahoma" w:eastAsia="Arial" w:hAnsi="Tahoma" w:cs="Tahoma"/>
+                <w:b/>
+                <w:bCs/>
+                <w:sz w:val="16"/>
+                <w:szCs w:val="16"/>
+              </w:rPr>
+              <w:t>Total :</w:t>
+            </w:r>
+            <w:proofErr w:type="gramEnd"/>
+            <w:r>
+              <w:rPr>
+                <w:rFonts w:ascii="Tahoma" w:eastAsia="Arial" w:hAnsi="Tahoma" w:cs="Tahoma"/>
+                <w:b/>
+                <w:bCs/>
+                <w:sz w:val="16"/>
+                <w:szCs w:val="16"/>
+              </w:rPr>
+              <w:t xml:space="preserve"> {</w:t>
             </w:r>
             <w:proofErr w:type="spellStart"/>
             <w:r>
@@ -1192,7 +1150,7 @@
                 <w:sz w:val="16"/>
                 <w:szCs w:val="16"/>
               </w:rPr>
-              <w:t>ServiceDetails</w:t>
+              <w:t>GrandTotal</w:t>
             </w:r>
             <w:proofErr w:type="spellEnd"/>
             <w:r>
@@ -1224,7 +1182,7 @@
                 <w:sz w:val="16"/>
                 <w:szCs w:val="16"/>
               </w:rPr>
-              <w:t>{</w:t>
+              <w:t>In Words: {</w:t>
             </w:r>
             <w:proofErr w:type="spellStart"/>
             <w:r>
@@ -1235,7 +1193,7 @@
                 <w:sz w:val="16"/>
                 <w:szCs w:val="16"/>
               </w:rPr>
-              <w:t>ServiceItems</w:t>
+              <w:t>TotalInWords</w:t>
             </w:r>
             <w:proofErr w:type="spellEnd"/>
             <w:r>
@@ -1248,82 +1206,6 @@
               </w:rPr>
               <w:t>}</w:t>
             </w:r>
-          </w:p>
-          <w:p>
-            <w:pPr>
-              <w:rPr>
-                <w:rFonts w:ascii="Tahoma" w:eastAsia="Arial" w:hAnsi="Tahoma" w:cs="Tahoma"/>
-                <w:b/>
-                <w:bCs/>
-                <w:sz w:val="16"/>
-                <w:szCs w:val="16"/>
-              </w:rPr>
-            </w:pPr>
-          </w:p>
-          <w:p>
-            <w:pPr>
-              <w:rPr>
-                <w:rFonts w:ascii="Tahoma" w:eastAsia="Arial" w:hAnsi="Tahoma" w:cs="Tahoma"/>
-                <w:b/>
-                <w:bCs/>
-                <w:sz w:val="16"/>
-                <w:szCs w:val="16"/>
-              </w:rPr>
-            </w:pPr>
-            <w:r>
-              <w:rPr>
-                <w:rFonts w:ascii="Tahoma" w:eastAsia="Arial" w:hAnsi="Tahoma" w:cs="Tahoma"/>
-                <w:b/>
-                <w:bCs/>
-                <w:sz w:val="16"/>
-                <w:szCs w:val="16"/>
-              </w:rPr>
-              <w:t>Total : {</w:t>
-            </w:r>
-            <w:proofErr w:type="spellStart"/>
-            <w:r>
-              <w:rPr>
-                <w:rFonts w:ascii="Tahoma" w:eastAsia="Arial" w:hAnsi="Tahoma" w:cs="Tahoma"/>
-                <w:b/>
-                <w:bCs/>
-                <w:sz w:val="16"/>
-                <w:szCs w:val="16"/>
-              </w:rPr>
-              <w:t>GrandTotal</w:t>
-            </w:r>
-            <w:proofErr w:type="spellEnd"/>
-            <w:r>
-              <w:rPr>
-                <w:rFonts w:ascii="Tahoma" w:eastAsia="Arial" w:hAnsi="Tahoma" w:cs="Tahoma"/>
-                <w:b/>
-                <w:bCs/>
-                <w:sz w:val="16"/>
-                <w:szCs w:val="16"/>
-              </w:rPr>
-              <w:t>}</w:t>
-            </w:r>
-          </w:p>
-          <w:p>
-            <w:pPr>
-              <w:rPr>
-                <w:rFonts w:ascii="Tahoma" w:eastAsia="Arial" w:hAnsi="Tahoma" w:cs="Tahoma"/>
-                <w:b/>
-                <w:bCs/>
-                <w:sz w:val="16"/>
-                <w:szCs w:val="16"/>
-              </w:rPr>
-            </w:pPr>
-          </w:p>
-          <w:p>
-            <w:pPr>
-              <w:rPr>
-                <w:rFonts w:ascii="Tahoma" w:eastAsia="Arial" w:hAnsi="Tahoma" w:cs="Tahoma"/>
-                <w:b/>
-                <w:bCs/>
-                <w:sz w:val="16"/>
-                <w:szCs w:val="16"/>
-              </w:rPr>
-            </w:pPr>
           </w:p>
         </w:tc>
       </w:tr>
@@ -1332,11 +1214,11 @@
           <w:tblLook w:val="0000" w:firstRow="0" w:lastRow="0" w:firstColumn="0" w:lastColumn="0" w:noHBand="0" w:noVBand="0"/>
         </w:tblPrEx>
         <w:trPr>
-          <w:trHeight w:val="586"/>
+          <w:trHeight w:val="620"/>
         </w:trPr>
         <w:tc>
           <w:tcPr>
-            <w:tcW w:w="16848" w:type="dxa"/>
+            <w:tcW w:w="18108" w:type="dxa"/>
             <w:gridSpan w:val="3"/>
             <w:tcBorders>
               <w:left w:val="single" w:sz="4" w:space="0" w:color="auto"/>
@@ -1360,16 +1242,38 @@
                 <w:sz w:val="16"/>
                 <w:szCs w:val="16"/>
               </w:rPr>
-              <w:t>Delivery Instructions(IF ANY): {</w:t>
+              <w:t xml:space="preserve">Delivery </w:t>
+            </w:r>
+            <w:proofErr w:type="gramStart"/>
+            <w:r>
+              <w:rPr>
+                <w:rFonts w:ascii="Tahoma" w:eastAsia="Arial" w:hAnsi="Tahoma" w:cs="Tahoma"/>
+                <w:b/>
+                <w:bCs/>
+                <w:sz w:val="16"/>
+                <w:szCs w:val="16"/>
+              </w:rPr>
+              <w:t>Instructions(</w:t>
+            </w:r>
+            <w:proofErr w:type="gramEnd"/>
+            <w:r>
+              <w:rPr>
+                <w:rFonts w:ascii="Tahoma" w:eastAsia="Arial" w:hAnsi="Tahoma" w:cs="Tahoma"/>
+                <w:b/>
+                <w:bCs/>
+                <w:sz w:val="16"/>
+                <w:szCs w:val="16"/>
+              </w:rPr>
+              <w:t>IF ANY): {</w:t>
             </w:r>
             <w:proofErr w:type="spellStart"/>
             <w:r>
               <w:rPr>
-                <w:rFonts w:ascii="Tahoma" w:hAnsi="Tahoma" w:cs="Tahoma"/>
-                <w:color w:val="000000"/>
-                <w:sz w:val="16"/>
-                <w:szCs w:val="16"/>
-                <w:highlight w:val="white"/>
+                <w:rFonts w:ascii="Tahoma" w:eastAsia="Arial" w:hAnsi="Tahoma" w:cs="Tahoma"/>
+                <w:b/>
+                <w:bCs/>
+                <w:sz w:val="16"/>
+                <w:szCs w:val="16"/>
               </w:rPr>
               <w:t>DeliveryInstruction</w:t>
             </w:r>
@@ -1387,7 +1291,6 @@
           </w:p>
           <w:p>
             <w:pPr>
-              <w:ind w:left="120"/>
               <w:rPr>
                 <w:rFonts w:ascii="Tahoma" w:eastAsia="Arial" w:hAnsi="Tahoma" w:cs="Tahoma"/>
                 <w:b/>
@@ -1399,7 +1302,6 @@
           </w:p>
           <w:p>
             <w:pPr>
-              <w:ind w:left="120"/>
               <w:rPr>
                 <w:rFonts w:ascii="Tahoma" w:eastAsia="Arial" w:hAnsi="Tahoma" w:cs="Tahoma"/>
                 <w:b/>
@@ -1408,35 +1310,46 @@
                 <w:szCs w:val="16"/>
               </w:rPr>
             </w:pPr>
-          </w:p>
-          <w:p>
-            <w:pPr>
-              <w:rPr>
-                <w:rFonts w:ascii="Tahoma" w:eastAsia="Arial" w:hAnsi="Tahoma" w:cs="Tahoma"/>
-                <w:b/>
-                <w:bCs/>
-                <w:sz w:val="16"/>
-                <w:szCs w:val="16"/>
-              </w:rPr>
-            </w:pPr>
-            <w:r>
-              <w:rPr>
-                <w:rFonts w:ascii="Tahoma" w:eastAsia="Arial" w:hAnsi="Tahoma" w:cs="Tahoma"/>
-                <w:b/>
-                <w:bCs/>
-                <w:sz w:val="16"/>
-                <w:szCs w:val="16"/>
-              </w:rPr>
-              <w:t>Special Instructions(IF ANY):{</w:t>
+            <w:r>
+              <w:rPr>
+                <w:rFonts w:ascii="Tahoma" w:eastAsia="Arial" w:hAnsi="Tahoma" w:cs="Tahoma"/>
+                <w:b/>
+                <w:bCs/>
+                <w:sz w:val="16"/>
+                <w:szCs w:val="16"/>
+              </w:rPr>
+              <w:t xml:space="preserve">Special </w:t>
+            </w:r>
+            <w:proofErr w:type="gramStart"/>
+            <w:r>
+              <w:rPr>
+                <w:rFonts w:ascii="Tahoma" w:eastAsia="Arial" w:hAnsi="Tahoma" w:cs="Tahoma"/>
+                <w:b/>
+                <w:bCs/>
+                <w:sz w:val="16"/>
+                <w:szCs w:val="16"/>
+              </w:rPr>
+              <w:t>Instructions(</w:t>
+            </w:r>
+            <w:proofErr w:type="gramEnd"/>
+            <w:r>
+              <w:rPr>
+                <w:rFonts w:ascii="Tahoma" w:eastAsia="Arial" w:hAnsi="Tahoma" w:cs="Tahoma"/>
+                <w:b/>
+                <w:bCs/>
+                <w:sz w:val="16"/>
+                <w:szCs w:val="16"/>
+              </w:rPr>
+              <w:t>IF ANY):{</w:t>
             </w:r>
             <w:proofErr w:type="spellStart"/>
             <w:r>
               <w:rPr>
-                <w:rFonts w:ascii="Tahoma" w:hAnsi="Tahoma" w:cs="Tahoma"/>
-                <w:color w:val="000000"/>
-                <w:sz w:val="16"/>
-                <w:szCs w:val="16"/>
-                <w:highlight w:val="white"/>
+                <w:rFonts w:ascii="Tahoma" w:eastAsia="Arial" w:hAnsi="Tahoma" w:cs="Tahoma"/>
+                <w:b/>
+                <w:bCs/>
+                <w:sz w:val="16"/>
+                <w:szCs w:val="16"/>
               </w:rPr>
               <w:t>SpecialInstruction</w:t>
             </w:r>
@@ -1449,74 +1362,8 @@
                 <w:sz w:val="16"/>
                 <w:szCs w:val="16"/>
               </w:rPr>
-              <w:t>}</w:t>
-            </w:r>
-          </w:p>
-          <w:p>
-            <w:pPr>
-              <w:rPr>
-                <w:rFonts w:ascii="Tahoma" w:eastAsia="Arial" w:hAnsi="Tahoma" w:cs="Tahoma"/>
-                <w:b/>
-                <w:bCs/>
-                <w:sz w:val="16"/>
-                <w:szCs w:val="16"/>
-              </w:rPr>
-            </w:pPr>
-          </w:p>
-          <w:p>
-            <w:pPr>
-              <w:rPr>
-                <w:rFonts w:ascii="Tahoma" w:eastAsia="Arial" w:hAnsi="Tahoma" w:cs="Tahoma"/>
-                <w:b/>
-                <w:bCs/>
-                <w:sz w:val="16"/>
-                <w:szCs w:val="16"/>
-              </w:rPr>
-            </w:pPr>
-            <w:r>
-              <w:rPr>
-                <w:rFonts w:ascii="Tahoma" w:eastAsia="Arial" w:hAnsi="Tahoma" w:cs="Tahoma"/>
-                <w:b/>
-                <w:bCs/>
-                <w:sz w:val="16"/>
-                <w:szCs w:val="16"/>
-              </w:rPr>
-              <w:t>{</w:t>
-            </w:r>
-            <w:proofErr w:type="spellStart"/>
-            <w:r>
-              <w:rPr>
-                <w:rFonts w:ascii="Tahoma" w:eastAsia="Arial" w:hAnsi="Tahoma" w:cs="Tahoma"/>
-                <w:b/>
-                <w:bCs/>
-                <w:sz w:val="16"/>
-                <w:szCs w:val="16"/>
-              </w:rPr>
-              <w:t>TermsAndCondition</w:t>
-            </w:r>
-            <w:proofErr w:type="spellEnd"/>
-            <w:r>
-              <w:rPr>
-                <w:rFonts w:ascii="Tahoma" w:eastAsia="Arial" w:hAnsi="Tahoma" w:cs="Tahoma"/>
-                <w:b/>
-                <w:bCs/>
-                <w:sz w:val="16"/>
-                <w:szCs w:val="16"/>
-              </w:rPr>
-              <w:t xml:space="preserve">}       </w:t>
-            </w:r>
-          </w:p>
-          <w:p>
-            <w:pPr>
-              <w:ind w:left="120"/>
-              <w:rPr>
-                <w:rFonts w:ascii="Tahoma" w:eastAsia="Arial" w:hAnsi="Tahoma" w:cs="Tahoma"/>
-                <w:b/>
-                <w:bCs/>
-                <w:sz w:val="16"/>
-                <w:szCs w:val="16"/>
-              </w:rPr>
-            </w:pPr>
+              <w:t xml:space="preserve">}                 </w:t>
+            </w:r>
           </w:p>
         </w:tc>
       </w:tr>
@@ -1525,11 +1372,11 @@
           <w:tblLook w:val="0000" w:firstRow="0" w:lastRow="0" w:firstColumn="0" w:lastColumn="0" w:noHBand="0" w:noVBand="0"/>
         </w:tblPrEx>
         <w:trPr>
-          <w:trHeight w:val="586"/>
+          <w:trHeight w:val="1610"/>
         </w:trPr>
         <w:tc>
           <w:tcPr>
-            <w:tcW w:w="16848" w:type="dxa"/>
+            <w:tcW w:w="18108" w:type="dxa"/>
             <w:gridSpan w:val="3"/>
             <w:tcBorders>
               <w:left w:val="single" w:sz="4" w:space="0" w:color="auto"/>
@@ -1537,16 +1384,6 @@
           </w:tcPr>
           <w:p>
             <w:pPr>
-              <w:spacing w:line="34" w:lineRule="exact"/>
-              <w:rPr>
-                <w:rFonts w:ascii="Tahoma" w:hAnsi="Tahoma" w:cs="Tahoma"/>
-                <w:sz w:val="16"/>
-                <w:szCs w:val="16"/>
-              </w:rPr>
-            </w:pPr>
-          </w:p>
-          <w:p>
-            <w:pPr>
               <w:spacing w:line="283" w:lineRule="auto"/>
               <w:ind w:right="1700"/>
               <w:rPr>
@@ -1567,26 +1404,37 @@
                 <w:szCs w:val="16"/>
                 <w:u w:val="single"/>
               </w:rPr>
-              <w:t>KINDLY SIGN THIS PURCHASE ORDER AND MAIL  US BACK ON +91-11-45020030/+91-11-25227023.</w:t>
-            </w:r>
-          </w:p>
-          <w:p>
-            <w:pPr>
-              <w:spacing w:line="283" w:lineRule="auto"/>
-              <w:ind w:right="1700"/>
-              <w:jc w:val="center"/>
-              <w:rPr>
-                <w:rFonts w:ascii="Tahoma" w:hAnsi="Tahoma" w:cs="Tahoma"/>
-                <w:sz w:val="16"/>
-                <w:szCs w:val="16"/>
-              </w:rPr>
-            </w:pPr>
+              <w:t>KINDLY SIGN THIS PURCHASE ORDER AND SEND US BACK BY EMAI</w:t>
+            </w:r>
+            <w:r>
+              <w:rPr>
+                <w:rFonts w:ascii="Tahoma" w:eastAsia="Arial" w:hAnsi="Tahoma" w:cs="Tahoma"/>
+                <w:b/>
+                <w:bCs/>
+                <w:sz w:val="16"/>
+                <w:szCs w:val="16"/>
+                <w:u w:val="single"/>
+              </w:rPr>
+              <w:t>L</w:t>
+            </w:r>
+            <w:r>
+              <w:rPr>
+                <w:rFonts w:ascii="Tahoma" w:eastAsia="Arial" w:hAnsi="Tahoma" w:cs="Tahoma"/>
+                <w:b/>
+                <w:bCs/>
+                <w:sz w:val="16"/>
+                <w:szCs w:val="16"/>
+                <w:u w:val="single"/>
+              </w:rPr>
+              <w:t>.</w:t>
+            </w:r>
           </w:p>
           <w:tbl>
             <w:tblPr>
               <w:tblStyle w:val="TableGrid"/>
-              <w:tblW w:w="13586" w:type="dxa"/>
-              <w:jc w:val="center"/>
+              <w:tblpPr w:leftFromText="180" w:rightFromText="180" w:vertAnchor="text" w:horzAnchor="margin" w:tblpY="80"/>
+              <w:tblOverlap w:val="never"/>
+              <w:tblW w:w="0" w:type="auto"/>
               <w:tblBorders>
                 <w:top w:val="none" w:sz="0" w:space="0" w:color="auto"/>
                 <w:left w:val="none" w:sz="0" w:space="0" w:color="auto"/>
@@ -1599,62 +1447,18 @@
               <w:tblLook w:val="04A0" w:firstRow="1" w:lastRow="0" w:firstColumn="1" w:lastColumn="0" w:noHBand="0" w:noVBand="1"/>
             </w:tblPr>
             <w:tblGrid>
-              <w:gridCol w:w="6792"/>
-              <w:gridCol w:w="6794"/>
+              <w:gridCol w:w="2787"/>
             </w:tblGrid>
             <w:tr>
               <w:trPr>
-                <w:trHeight w:val="208"/>
-                <w:jc w:val="center"/>
+                <w:trHeight w:val="1166"/>
               </w:trPr>
               <w:tc>
                 <w:tcPr>
-                  <w:tcW w:w="6792" w:type="dxa"/>
+                  <w:tcW w:w="2787" w:type="dxa"/>
                 </w:tcPr>
                 <w:p>
                   <w:pPr>
-                    <w:framePr w:hSpace="180" w:wrap="around" w:vAnchor="page" w:hAnchor="margin" w:xAlign="center" w:y="2476"/>
-                    <w:rPr>
-                      <w:rFonts w:ascii="Tahoma" w:eastAsia="Arial" w:hAnsi="Tahoma" w:cs="Tahoma"/>
-                      <w:bCs/>
-                      <w:sz w:val="16"/>
-                      <w:szCs w:val="16"/>
-                    </w:rPr>
-                  </w:pPr>
-                </w:p>
-              </w:tc>
-              <w:tc>
-                <w:tcPr>
-                  <w:tcW w:w="6794" w:type="dxa"/>
-                </w:tcPr>
-                <w:p>
-                  <w:pPr>
-                    <w:framePr w:hSpace="180" w:wrap="around" w:vAnchor="page" w:hAnchor="margin" w:xAlign="center" w:y="2476"/>
-                    <w:jc w:val="center"/>
-                    <w:rPr>
-                      <w:rFonts w:ascii="Tahoma" w:eastAsia="Arial" w:hAnsi="Tahoma" w:cs="Tahoma"/>
-                      <w:b/>
-                      <w:bCs/>
-                      <w:sz w:val="16"/>
-                      <w:szCs w:val="16"/>
-                      <w:u w:val="single"/>
-                    </w:rPr>
-                  </w:pPr>
-                </w:p>
-              </w:tc>
-            </w:tr>
-            <w:tr>
-              <w:trPr>
-                <w:trHeight w:val="164"/>
-                <w:jc w:val="center"/>
-              </w:trPr>
-              <w:tc>
-                <w:tcPr>
-                  <w:tcW w:w="6792" w:type="dxa"/>
-                </w:tcPr>
-                <w:p>
-                  <w:pPr>
-                    <w:framePr w:hSpace="180" w:wrap="around" w:vAnchor="page" w:hAnchor="margin" w:xAlign="center" w:y="2476"/>
                     <w:jc w:val="center"/>
                     <w:rPr>
                       <w:rFonts w:ascii="Tahoma" w:eastAsia="Arial" w:hAnsi="Tahoma" w:cs="Tahoma"/>
@@ -1675,7 +1479,6 @@
                 </w:p>
                 <w:p>
                   <w:pPr>
-                    <w:framePr w:hSpace="180" w:wrap="around" w:vAnchor="page" w:hAnchor="margin" w:xAlign="center" w:y="2476"/>
                     <w:jc w:val="center"/>
                     <w:rPr>
                       <w:rFonts w:ascii="Tahoma" w:eastAsia="Arial" w:hAnsi="Tahoma" w:cs="Tahoma"/>
@@ -1696,16 +1499,7 @@
                 </w:p>
                 <w:p>
                   <w:pPr>
-                    <w:framePr w:hSpace="180" w:wrap="around" w:vAnchor="page" w:hAnchor="margin" w:xAlign="center" w:y="2476"/>
-                    <w:spacing w:line="278" w:lineRule="auto"/>
-                    <w:ind w:right="40"/>
                     <w:jc w:val="center"/>
-                    <w:rPr>
-                      <w:rFonts w:ascii="Tahoma" w:eastAsia="Arial" w:hAnsi="Tahoma" w:cs="Tahoma"/>
-                      <w:b/>
-                      <w:sz w:val="16"/>
-                      <w:szCs w:val="16"/>
-                    </w:rPr>
                   </w:pPr>
                   <w:r>
                     <w:rPr>
@@ -1715,21 +1509,32 @@
                       <w:sz w:val="16"/>
                       <w:szCs w:val="16"/>
                     </w:rPr>
-                    <w:t xml:space="preserve">For </w:t>
+                    <w:t xml:space="preserve"> </w:t>
                   </w:r>
                   <w:r>
                     <w:rPr>
-                      <w:rFonts w:ascii="Tahoma" w:eastAsia="Arial" w:hAnsi="Tahoma" w:cs="Tahoma"/>
+                      <w:rFonts w:ascii="Tahoma" w:hAnsi="Tahoma" w:cs="Tahoma"/>
                       <w:b/>
+                      <w:color w:val="000000" w:themeColor="text1"/>
                       <w:sz w:val="16"/>
                       <w:szCs w:val="16"/>
                     </w:rPr>
-                    <w:t xml:space="preserve"> Sadma Fashion Wear Ltd</w:t>
+                    <w:t>Auburn</w:t>
+                  </w:r>
+                  <w:r>
+                    <w:rPr>
+                      <w:rFonts w:ascii="Tahoma" w:hAnsi="Tahoma" w:cs="Tahoma"/>
+                      <w:b/>
+                      <w:bCs/>
+                      <w:sz w:val="16"/>
+                      <w:szCs w:val="16"/>
+                      <w:shd w:val="clear" w:color="auto" w:fill="FFFFFF"/>
+                    </w:rPr>
+                    <w:t xml:space="preserve"> Design Private Limited</w:t>
                   </w:r>
                 </w:p>
                 <w:p>
                   <w:pPr>
-                    <w:framePr w:hSpace="180" w:wrap="around" w:vAnchor="page" w:hAnchor="margin" w:xAlign="center" w:y="2476"/>
                     <w:jc w:val="center"/>
                     <w:rPr>
                       <w:rFonts w:ascii="Tahoma" w:eastAsia="Arial" w:hAnsi="Tahoma" w:cs="Tahoma"/>
@@ -1742,7 +1547,6 @@
                 </w:p>
                 <w:p>
                   <w:pPr>
-                    <w:framePr w:hSpace="180" w:wrap="around" w:vAnchor="page" w:hAnchor="margin" w:xAlign="center" w:y="2476"/>
                     <w:jc w:val="center"/>
                     <w:rPr>
                       <w:rFonts w:ascii="Tahoma" w:eastAsia="Arial" w:hAnsi="Tahoma" w:cs="Tahoma"/>
@@ -1755,7 +1559,6 @@
                 </w:p>
                 <w:p>
                   <w:pPr>
-                    <w:framePr w:hSpace="180" w:wrap="around" w:vAnchor="page" w:hAnchor="margin" w:xAlign="center" w:y="2476"/>
                     <w:jc w:val="center"/>
                     <w:rPr>
                       <w:rFonts w:ascii="Tahoma" w:eastAsia="Arial" w:hAnsi="Tahoma" w:cs="Tahoma"/>
@@ -1774,122 +1577,6 @@
                     <w:t>Authorized Signature</w:t>
                   </w:r>
                 </w:p>
-                <w:p>
-                  <w:pPr>
-                    <w:framePr w:hSpace="180" w:wrap="around" w:vAnchor="page" w:hAnchor="margin" w:xAlign="center" w:y="2476"/>
-                    <w:rPr>
-                      <w:rFonts w:ascii="Tahoma" w:eastAsia="Arial" w:hAnsi="Tahoma" w:cs="Tahoma"/>
-                      <w:b/>
-                      <w:bCs/>
-                      <w:sz w:val="16"/>
-                      <w:szCs w:val="16"/>
-                      <w:u w:val="single"/>
-                    </w:rPr>
-                  </w:pPr>
-                </w:p>
-              </w:tc>
-              <w:tc>
-                <w:tcPr>
-                  <w:tcW w:w="6794" w:type="dxa"/>
-                </w:tcPr>
-                <w:p>
-                  <w:pPr>
-                    <w:framePr w:hSpace="180" w:wrap="around" w:vAnchor="page" w:hAnchor="margin" w:xAlign="center" w:y="2476"/>
-                    <w:jc w:val="center"/>
-                    <w:rPr>
-                      <w:rFonts w:ascii="Tahoma" w:eastAsia="Arial" w:hAnsi="Tahoma" w:cs="Tahoma"/>
-                      <w:b/>
-                      <w:bCs/>
-                      <w:sz w:val="16"/>
-                      <w:szCs w:val="16"/>
-                      <w:u w:val="single"/>
-                    </w:rPr>
-                  </w:pPr>
-                </w:p>
-                <w:p>
-                  <w:pPr>
-                    <w:framePr w:hSpace="180" w:wrap="around" w:vAnchor="page" w:hAnchor="margin" w:xAlign="center" w:y="2476"/>
-                    <w:jc w:val="center"/>
-                    <w:rPr>
-                      <w:rFonts w:ascii="Tahoma" w:eastAsia="Arial" w:hAnsi="Tahoma" w:cs="Tahoma"/>
-                      <w:b/>
-                      <w:bCs/>
-                      <w:sz w:val="16"/>
-                      <w:szCs w:val="16"/>
-                    </w:rPr>
-                  </w:pPr>
-                </w:p>
-                <w:p>
-                  <w:pPr>
-                    <w:framePr w:hSpace="180" w:wrap="around" w:vAnchor="page" w:hAnchor="margin" w:xAlign="center" w:y="2476"/>
-                    <w:jc w:val="center"/>
-                    <w:rPr>
-                      <w:rFonts w:ascii="Tahoma" w:eastAsia="Arial" w:hAnsi="Tahoma" w:cs="Tahoma"/>
-                      <w:b/>
-                      <w:bCs/>
-                      <w:sz w:val="16"/>
-                      <w:szCs w:val="16"/>
-                    </w:rPr>
-                  </w:pPr>
-                  <w:r>
-                    <w:rPr>
-                      <w:rFonts w:ascii="Tahoma" w:eastAsia="Arial" w:hAnsi="Tahoma" w:cs="Tahoma"/>
-                      <w:b/>
-                      <w:bCs/>
-                      <w:sz w:val="16"/>
-                      <w:szCs w:val="16"/>
-                    </w:rPr>
-                    <w:t>For {VendorName}</w:t>
-                  </w:r>
-                </w:p>
-                <w:p>
-                  <w:pPr>
-                    <w:framePr w:hSpace="180" w:wrap="around" w:vAnchor="page" w:hAnchor="margin" w:xAlign="center" w:y="2476"/>
-                    <w:jc w:val="center"/>
-                    <w:rPr>
-                      <w:rFonts w:ascii="Tahoma" w:eastAsia="Arial" w:hAnsi="Tahoma" w:cs="Tahoma"/>
-                      <w:b/>
-                      <w:bCs/>
-                      <w:sz w:val="16"/>
-                      <w:szCs w:val="16"/>
-                      <w:u w:val="single"/>
-                    </w:rPr>
-                  </w:pPr>
-                </w:p>
-                <w:p>
-                  <w:pPr>
-                    <w:framePr w:hSpace="180" w:wrap="around" w:vAnchor="page" w:hAnchor="margin" w:xAlign="center" w:y="2476"/>
-                    <w:rPr>
-                      <w:rFonts w:ascii="Tahoma" w:eastAsia="Arial" w:hAnsi="Tahoma" w:cs="Tahoma"/>
-                      <w:b/>
-                      <w:bCs/>
-                      <w:sz w:val="16"/>
-                      <w:szCs w:val="16"/>
-                      <w:u w:val="single"/>
-                    </w:rPr>
-                  </w:pPr>
-                </w:p>
-                <w:p>
-                  <w:pPr>
-                    <w:framePr w:hSpace="180" w:wrap="around" w:vAnchor="page" w:hAnchor="margin" w:xAlign="center" w:y="2476"/>
-                    <w:jc w:val="center"/>
-                    <w:rPr>
-                      <w:rFonts w:ascii="Tahoma" w:eastAsia="Arial" w:hAnsi="Tahoma" w:cs="Tahoma"/>
-                      <w:bCs/>
-                      <w:sz w:val="16"/>
-                      <w:szCs w:val="16"/>
-                    </w:rPr>
-                  </w:pPr>
-                  <w:r>
-                    <w:rPr>
-                      <w:rFonts w:ascii="Tahoma" w:eastAsia="Arial" w:hAnsi="Tahoma" w:cs="Tahoma"/>
-                      <w:bCs/>
-                      <w:sz w:val="16"/>
-                      <w:szCs w:val="16"/>
-                    </w:rPr>
-                    <w:t>Signature With Stamp</w:t>
-                  </w:r>
-                </w:p>
               </w:tc>
             </w:tr>
           </w:tbl>
@@ -1911,11 +1598,11 @@
           <w:tblLook w:val="0000" w:firstRow="0" w:lastRow="0" w:firstColumn="0" w:lastColumn="0" w:noHBand="0" w:noVBand="0"/>
         </w:tblPrEx>
         <w:trPr>
-          <w:trHeight w:val="797"/>
+          <w:trHeight w:val="732"/>
         </w:trPr>
         <w:tc>
           <w:tcPr>
-            <w:tcW w:w="16848" w:type="dxa"/>
+            <w:tcW w:w="18108" w:type="dxa"/>
             <w:gridSpan w:val="3"/>
             <w:tcBorders>
               <w:left w:val="single" w:sz="4" w:space="0" w:color="auto"/>
@@ -1924,6 +1611,8 @@
           </w:tcPr>
           <w:p>
             <w:pPr>
+              <w:spacing w:line="283" w:lineRule="auto"/>
+              <w:ind w:right="1700"/>
               <w:rPr>
                 <w:rFonts w:ascii="Tahoma" w:hAnsi="Tahoma" w:cs="Tahoma"/>
                 <w:sz w:val="16"/>
@@ -1934,9 +1623,8 @@
           <w:tbl>
             <w:tblPr>
               <w:tblStyle w:val="TableGrid"/>
-              <w:tblpPr w:leftFromText="180" w:rightFromText="180" w:vertAnchor="text" w:horzAnchor="margin" w:tblpXSpec="center" w:tblpYSpec="bottom"/>
-              <w:tblOverlap w:val="never"/>
               <w:tblW w:w="0" w:type="auto"/>
+              <w:jc w:val="center"/>
               <w:tblBorders>
                 <w:top w:val="none" w:sz="0" w:space="0" w:color="auto"/>
                 <w:left w:val="none" w:sz="0" w:space="0" w:color="auto"/>
@@ -1949,20 +1637,22 @@
               <w:tblLook w:val="04A0" w:firstRow="1" w:lastRow="0" w:firstColumn="1" w:lastColumn="0" w:noHBand="0" w:noVBand="1"/>
             </w:tblPr>
             <w:tblGrid>
-              <w:gridCol w:w="3249"/>
-              <w:gridCol w:w="3249"/>
-              <w:gridCol w:w="3249"/>
+              <w:gridCol w:w="3384"/>
+              <w:gridCol w:w="3384"/>
+              <w:gridCol w:w="3384"/>
             </w:tblGrid>
             <w:tr>
               <w:trPr>
-                <w:trHeight w:val="235"/>
+                <w:trHeight w:val="246"/>
+                <w:jc w:val="center"/>
               </w:trPr>
               <w:tc>
                 <w:tcPr>
-                  <w:tcW w:w="3249" w:type="dxa"/>
+                  <w:tcW w:w="3384" w:type="dxa"/>
                 </w:tcPr>
                 <w:p>
                   <w:pPr>
+                    <w:framePr w:hSpace="180" w:wrap="around" w:vAnchor="page" w:hAnchor="margin" w:xAlign="center" w:y="1831"/>
                     <w:jc w:val="center"/>
                     <w:rPr>
                       <w:rFonts w:ascii="Tahoma" w:eastAsia="Arial" w:hAnsi="Tahoma" w:cs="Tahoma"/>
@@ -1983,7 +1673,7 @@
                     <mc:AlternateContent>
                       <mc:Choice Requires="wps">
                         <w:drawing>
-                          <wp:anchor distT="0" distB="0" distL="114300" distR="114300" simplePos="0" relativeHeight="251684864" behindDoc="0" locked="0" layoutInCell="1" allowOverlap="1" wp14:anchorId="4E9798DF" wp14:editId="28D08F6F">
+                          <wp:anchor distT="0" distB="0" distL="114300" distR="114300" simplePos="0" relativeHeight="251659264" behindDoc="0" locked="0" layoutInCell="1" allowOverlap="1" wp14:anchorId="05130433" wp14:editId="4594DD16">
                             <wp:simplePos x="0" y="0"/>
                             <wp:positionH relativeFrom="column">
                               <wp:posOffset>383679</wp:posOffset>
@@ -2033,7 +1723,7 @@
                       </mc:Choice>
                       <mc:Fallback>
                         <w:pict>
-                          <v:line w14:anchorId="6A8A9453" id="Straight Connector 3" o:spid="_x0000_s1026" style="position:absolute;flip:x;z-index:251684864;visibility:visible;mso-wrap-style:square;mso-width-percent:0;mso-height-percent:0;mso-wrap-distance-left:9pt;mso-wrap-distance-top:0;mso-wrap-distance-right:9pt;mso-wrap-distance-bottom:0;mso-position-horizontal:absolute;mso-position-horizontal-relative:text;mso-position-vertical:absolute;mso-position-vertical-relative:text;mso-width-percent:0;mso-height-percent:0;mso-width-relative:margin;mso-height-relative:margin" from="30.2pt,8.35pt" to="139.75pt,8.35pt" o:gfxdata="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" strokecolor="windowText" strokeweight=".5pt">
+                          <v:line w14:anchorId="762DB0D0" id="Straight Connector 3" o:spid="_x0000_s1026" style="position:absolute;flip:x;z-index:251659264;visibility:visible;mso-wrap-style:square;mso-width-percent:0;mso-height-percent:0;mso-wrap-distance-left:9pt;mso-wrap-distance-top:0;mso-wrap-distance-right:9pt;mso-wrap-distance-bottom:0;mso-position-horizontal:absolute;mso-position-horizontal-relative:text;mso-position-vertical:absolute;mso-position-vertical-relative:text;mso-width-percent:0;mso-height-percent:0;mso-width-relative:margin;mso-height-relative:margin" from="30.2pt,8.35pt" to="139.75pt,8.35pt" o:gfxdata="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" strokecolor="windowText" strokeweight=".5pt">
                             <v:stroke joinstyle="miter"/>
                           </v:line>
                         </w:pict>
@@ -2052,7 +1742,7 @@
                   <w:proofErr w:type="spellStart"/>
                   <w:r>
                     <w:rPr>
-                      <w:rFonts w:ascii="Tahoma" w:eastAsia="Calibri" w:hAnsi="Tahoma" w:cs="Tahoma"/>
+                      <w:rFonts w:ascii="Tahoma" w:hAnsi="Tahoma" w:cs="Tahoma"/>
                       <w:color w:val="000000"/>
                       <w:sz w:val="16"/>
                       <w:szCs w:val="16"/>
@@ -2074,10 +1764,11 @@
               </w:tc>
               <w:tc>
                 <w:tcPr>
-                  <w:tcW w:w="3249" w:type="dxa"/>
+                  <w:tcW w:w="3384" w:type="dxa"/>
                 </w:tcPr>
                 <w:p>
                   <w:pPr>
+                    <w:framePr w:hSpace="180" w:wrap="around" w:vAnchor="page" w:hAnchor="margin" w:xAlign="center" w:y="1831"/>
                     <w:jc w:val="center"/>
                     <w:rPr>
                       <w:rFonts w:ascii="Tahoma" w:eastAsia="Arial" w:hAnsi="Tahoma" w:cs="Tahoma"/>
@@ -2098,7 +1789,7 @@
                     <mc:AlternateContent>
                       <mc:Choice Requires="wps">
                         <w:drawing>
-                          <wp:anchor distT="0" distB="0" distL="114300" distR="114300" simplePos="0" relativeHeight="251685888" behindDoc="0" locked="0" layoutInCell="1" allowOverlap="1" wp14:anchorId="641B68CB" wp14:editId="0A901AED">
+                          <wp:anchor distT="0" distB="0" distL="114300" distR="114300" simplePos="0" relativeHeight="251660288" behindDoc="0" locked="0" layoutInCell="1" allowOverlap="1" wp14:anchorId="7AF2768C" wp14:editId="42BAC5BB">
                             <wp:simplePos x="0" y="0"/>
                             <wp:positionH relativeFrom="column">
                               <wp:posOffset>298395</wp:posOffset>
@@ -2109,7 +1800,7 @@
                             <wp:extent cx="1526650" cy="0"/>
                             <wp:effectExtent l="0" t="0" r="16510" b="19050"/>
                             <wp:wrapNone/>
-                            <wp:docPr id="2" name="Straight Connector 2"/>
+                            <wp:docPr id="1" name="Straight Connector 1"/>
                             <wp:cNvGraphicFramePr/>
                             <a:graphic xmlns:a="http://schemas.openxmlformats.org/drawingml/2006/main">
                               <a:graphicData uri="http://schemas.microsoft.com/office/word/2010/wordprocessingShape">
@@ -2145,7 +1836,7 @@
                       </mc:Choice>
                       <mc:Fallback>
                         <w:pict>
-                          <v:line w14:anchorId="0A7719CC" id="Straight Connector 2" o:spid="_x0000_s1026" style="position:absolute;z-index:251685888;visibility:visible;mso-wrap-style:square;mso-width-percent:0;mso-wrap-distance-left:9pt;mso-wrap-distance-top:0;mso-wrap-distance-right:9pt;mso-wrap-distance-bottom:0;mso-position-horizontal:absolute;mso-position-horizontal-relative:text;mso-position-vertical:absolute;mso-position-vertical-relative:text;mso-width-percent:0;mso-width-relative:margin" from="23.5pt,8.35pt" to="143.7pt,8.35pt" o:gfxdata="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" strokecolor="windowText" strokeweight=".5pt">
+                          <v:line w14:anchorId="530591DD" id="Straight Connector 1" o:spid="_x0000_s1026" style="position:absolute;z-index:251660288;visibility:visible;mso-wrap-style:square;mso-width-percent:0;mso-wrap-distance-left:9pt;mso-wrap-distance-top:0;mso-wrap-distance-right:9pt;mso-wrap-distance-bottom:0;mso-position-horizontal:absolute;mso-position-horizontal-relative:text;mso-position-vertical:absolute;mso-position-vertical-relative:text;mso-width-percent:0;mso-width-relative:margin" from="23.5pt,8.35pt" to="143.7pt,8.35pt" o:gfxdata="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" strokecolor="windowText" strokeweight=".5pt">
                             <v:stroke joinstyle="miter"/>
                           </v:line>
                         </w:pict>
@@ -2159,12 +1850,12 @@
                       <w:sz w:val="16"/>
                       <w:szCs w:val="16"/>
                     </w:rPr>
-                    <w:t xml:space="preserve">       {</w:t>
+                    <w:t xml:space="preserve">          {</w:t>
                   </w:r>
                   <w:proofErr w:type="spellStart"/>
                   <w:r>
                     <w:rPr>
-                      <w:rFonts w:ascii="Tahoma" w:eastAsia="Calibri" w:hAnsi="Tahoma" w:cs="Tahoma"/>
+                      <w:rFonts w:ascii="Tahoma" w:hAnsi="Tahoma" w:cs="Tahoma"/>
                       <w:color w:val="000000"/>
                       <w:sz w:val="16"/>
                       <w:szCs w:val="16"/>
@@ -2186,10 +1877,11 @@
               </w:tc>
               <w:tc>
                 <w:tcPr>
-                  <w:tcW w:w="3249" w:type="dxa"/>
+                  <w:tcW w:w="3384" w:type="dxa"/>
                 </w:tcPr>
                 <w:p>
                   <w:pPr>
+                    <w:framePr w:hSpace="180" w:wrap="around" w:vAnchor="page" w:hAnchor="margin" w:xAlign="center" w:y="1831"/>
                     <w:jc w:val="center"/>
                     <w:rPr>
                       <w:rFonts w:ascii="Tahoma" w:eastAsia="Arial" w:hAnsi="Tahoma" w:cs="Tahoma"/>
@@ -2210,7 +1902,7 @@
                     <mc:AlternateContent>
                       <mc:Choice Requires="wps">
                         <w:drawing>
-                          <wp:anchor distT="0" distB="0" distL="114300" distR="114300" simplePos="0" relativeHeight="251686912" behindDoc="0" locked="0" layoutInCell="1" allowOverlap="1" wp14:anchorId="5565AE25" wp14:editId="38D69630">
+                          <wp:anchor distT="0" distB="0" distL="114300" distR="114300" simplePos="0" relativeHeight="251661312" behindDoc="0" locked="0" layoutInCell="1" allowOverlap="1" wp14:anchorId="12406DEE" wp14:editId="4CC5F284">
                             <wp:simplePos x="0" y="0"/>
                             <wp:positionH relativeFrom="column">
                               <wp:posOffset>395991</wp:posOffset>
@@ -2221,7 +1913,7 @@
                             <wp:extent cx="1423283" cy="0"/>
                             <wp:effectExtent l="0" t="0" r="24765" b="19050"/>
                             <wp:wrapNone/>
-                            <wp:docPr id="5" name="Straight Connector 5"/>
+                            <wp:docPr id="2" name="Straight Connector 2"/>
                             <wp:cNvGraphicFramePr/>
                             <a:graphic xmlns:a="http://schemas.openxmlformats.org/drawingml/2006/main">
                               <a:graphicData uri="http://schemas.microsoft.com/office/word/2010/wordprocessingShape">
@@ -2254,7 +1946,7 @@
                       </mc:Choice>
                       <mc:Fallback>
                         <w:pict>
-                          <v:line w14:anchorId="62EEFCA7" id="Straight Connector 5" o:spid="_x0000_s1026" style="position:absolute;z-index:251686912;visibility:visible;mso-wrap-style:square;mso-wrap-distance-left:9pt;mso-wrap-distance-top:0;mso-wrap-distance-right:9pt;mso-wrap-distance-bottom:0;mso-position-horizontal:absolute;mso-position-horizontal-relative:text;mso-position-vertical:absolute;mso-position-vertical-relative:text" from="31.2pt,8.35pt" to="143.25pt,8.35pt" o:gfxdata="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" strokecolor="windowText" strokeweight=".5pt">
+                          <v:line w14:anchorId="676B46B1" id="Straight Connector 2" o:spid="_x0000_s1026" style="position:absolute;z-index:251661312;visibility:visible;mso-wrap-style:square;mso-wrap-distance-left:9pt;mso-wrap-distance-top:0;mso-wrap-distance-right:9pt;mso-wrap-distance-bottom:0;mso-position-horizontal:absolute;mso-position-horizontal-relative:text;mso-position-vertical:absolute;mso-position-vertical-relative:text" from="31.2pt,8.35pt" to="143.25pt,8.35pt" o:gfxdata="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" strokecolor="windowText" strokeweight=".5pt">
                             <v:stroke joinstyle="miter"/>
                           </v:line>
                         </w:pict>
@@ -2273,7 +1965,7 @@
                   <w:proofErr w:type="spellStart"/>
                   <w:r>
                     <w:rPr>
-                      <w:rFonts w:ascii="Tahoma" w:eastAsia="Calibri" w:hAnsi="Tahoma" w:cs="Tahoma"/>
+                      <w:rFonts w:ascii="Tahoma" w:hAnsi="Tahoma" w:cs="Tahoma"/>
                       <w:color w:val="000000"/>
                       <w:sz w:val="16"/>
                       <w:szCs w:val="16"/>
@@ -2296,14 +1988,16 @@
             </w:tr>
             <w:tr>
               <w:trPr>
-                <w:trHeight w:val="219"/>
+                <w:trHeight w:val="229"/>
+                <w:jc w:val="center"/>
               </w:trPr>
               <w:tc>
                 <w:tcPr>
-                  <w:tcW w:w="3249" w:type="dxa"/>
+                  <w:tcW w:w="3384" w:type="dxa"/>
                 </w:tcPr>
                 <w:p>
                   <w:pPr>
+                    <w:framePr w:hSpace="180" w:wrap="around" w:vAnchor="page" w:hAnchor="margin" w:xAlign="center" w:y="1831"/>
                     <w:jc w:val="center"/>
                     <w:rPr>
                       <w:rFonts w:ascii="Tahoma" w:eastAsia="Arial" w:hAnsi="Tahoma" w:cs="Tahoma"/>
@@ -2327,10 +2021,11 @@
               </w:tc>
               <w:tc>
                 <w:tcPr>
-                  <w:tcW w:w="3249" w:type="dxa"/>
+                  <w:tcW w:w="3384" w:type="dxa"/>
                 </w:tcPr>
                 <w:p>
                   <w:pPr>
+                    <w:framePr w:hSpace="180" w:wrap="around" w:vAnchor="page" w:hAnchor="margin" w:xAlign="center" w:y="1831"/>
                     <w:jc w:val="center"/>
                     <w:rPr>
                       <w:rFonts w:ascii="Tahoma" w:eastAsia="Arial" w:hAnsi="Tahoma" w:cs="Tahoma"/>
@@ -2348,16 +2043,17 @@
                       <w:sz w:val="16"/>
                       <w:szCs w:val="16"/>
                     </w:rPr>
-                    <w:t xml:space="preserve">         Checked By</w:t>
+                    <w:t xml:space="preserve">      Checked By</w:t>
                   </w:r>
                 </w:p>
               </w:tc>
               <w:tc>
                 <w:tcPr>
-                  <w:tcW w:w="3249" w:type="dxa"/>
+                  <w:tcW w:w="3384" w:type="dxa"/>
                 </w:tcPr>
                 <w:p>
                   <w:pPr>
+                    <w:framePr w:hSpace="180" w:wrap="around" w:vAnchor="page" w:hAnchor="margin" w:xAlign="center" w:y="1831"/>
                     <w:jc w:val="center"/>
                     <w:rPr>
                       <w:rFonts w:ascii="Tahoma" w:eastAsia="Arial" w:hAnsi="Tahoma" w:cs="Tahoma"/>
@@ -2398,39 +2094,24 @@
     </w:tbl>
     <w:p>
       <w:pPr>
-        <w:tabs>
-          <w:tab w:val="left" w:pos="2310"/>
-          <w:tab w:val="left" w:pos="4920"/>
-        </w:tabs>
+        <w:jc w:val="center"/>
         <w:rPr>
           <w:rFonts w:ascii="Arial Narrow" w:hAnsi="Arial Narrow" w:cs="Arial"/>
+          <w:noProof/>
           <w:sz w:val="20"/>
           <w:szCs w:val="20"/>
         </w:rPr>
       </w:pPr>
-      <w:r>
-        <w:rPr>
-          <w:rFonts w:ascii="Arial Narrow" w:hAnsi="Arial Narrow" w:cs="Arial"/>
-          <w:sz w:val="20"/>
-          <w:szCs w:val="20"/>
-        </w:rPr>
-        <w:lastRenderedPageBreak/>
-        <w:tab/>
-      </w:r>
-      <w:r>
-        <w:rPr>
-          <w:rFonts w:ascii="Arial Narrow" w:hAnsi="Arial Narrow" w:cs="Arial"/>
-          <w:sz w:val="20"/>
-          <w:szCs w:val="20"/>
-        </w:rPr>
-        <w:tab/>
-      </w:r>
     </w:p>
     <w:sectPr>
-      <w:headerReference w:type="default" r:id="rId8"/>
-      <w:footerReference w:type="default" r:id="rId9"/>
+      <w:headerReference w:type="even" r:id="rId8"/>
+      <w:headerReference w:type="default" r:id="rId9"/>
+      <w:footerReference w:type="even" r:id="rId10"/>
+      <w:footerReference w:type="default" r:id="rId11"/>
+      <w:headerReference w:type="first" r:id="rId12"/>
+      <w:footerReference w:type="first" r:id="rId13"/>
       <w:pgSz w:w="20160" w:h="12240" w:orient="landscape" w:code="5"/>
-      <w:pgMar w:top="1440" w:right="1800" w:bottom="1440" w:left="1800" w:header="0" w:footer="0" w:gutter="0"/>
+      <w:pgMar w:top="1440" w:right="1800" w:bottom="1440" w:left="1800" w:header="288" w:footer="0" w:gutter="0"/>
       <w:cols w:space="720"/>
       <w:docGrid w:linePitch="360"/>
     </w:sectPr>
@@ -2459,9 +2140,19 @@
 
 <file path=word/footer1.xml><?xml version="1.0" encoding="utf-8"?>
 <w:ftr xmlns:wpc="http://schemas.microsoft.com/office/word/2010/wordprocessingCanvas" xmlns:cx="http://schemas.microsoft.com/office/drawing/2014/chartex" xmlns:cx1="http://schemas.microsoft.com/office/drawing/2015/9/8/chartex" xmlns:cx2="http://schemas.microsoft.com/office/drawing/2015/10/21/chartex" xmlns:cx3="http://schemas.microsoft.com/office/drawing/2016/5/9/chartex" xmlns:cx4="http://schemas.microsoft.com/office/drawing/2016/5/10/chartex" xmlns:cx5="http://schemas.microsoft.com/office/drawing/2016/5/11/chartex" xmlns:cx6="http://schemas.microsoft.com/office/drawing/2016/5/12/chartex" xmlns:cx7="http://schemas.microsoft.com/office/drawing/2016/5/13/chartex" xmlns:cx8="http://schemas.microsoft.com/office/drawing/2016/5/14/chartex" xmlns:mc="http://schemas.openxmlformats.org/markup-compatibility/2006" xmlns:aink="http://schemas.microsoft.com/office/drawing/2016/ink" xmlns:am3d="http://schemas.microsoft.com/office/drawing/2017/model3d" xmlns:o="urn:schemas-microsoft-com:office:office" xmlns:r="http://schemas.openxmlformats.org/officeDocument/2006/relationships" xmlns:m="http://schemas.openxmlformats.org/officeDocument/2006/math" xmlns:v="urn:schemas-microsoft-com:vml" xmlns:wp14="http://schemas.microsoft.com/office/word/2010/wordprocessingDrawing" xmlns:wp="http://schemas.openxmlformats.org/drawingml/2006/wordprocessingDrawing" xmlns:w10="urn:schemas-microsoft-com:office:word" xmlns:w="http://schemas.openxmlformats.org/wordprocessingml/2006/main" xmlns:w14="http://schemas.microsoft.com/office/word/2010/wordml" xmlns:w15="http://schemas.microsoft.com/office/word/2012/wordml" xmlns:w16cex="http://schemas.microsoft.com/office/word/2018/wordml/cex" xmlns:w16cid="http://schemas.microsoft.com/office/word/2016/wordml/cid" xmlns:w16="http://schemas.microsoft.com/office/word/2018/wordml" xmlns:w16sdtdh="http://schemas.microsoft.com/office/word/2020/wordml/sdtdatahash" xmlns:w16se="http://schemas.microsoft.com/office/word/2015/wordml/symex" xmlns:wpg="http://schemas.microsoft.com/office/word/2010/wordprocessingGroup" xmlns:wpi="http://schemas.microsoft.com/office/word/2010/wordprocessingInk" xmlns:wne="http://schemas.microsoft.com/office/word/2006/wordml" xmlns:wps="http://schemas.microsoft.com/office/word/2010/wordprocessingShape" mc:Ignorable="w14 w15 w16se w16cid w16 w16cex w16sdtdh wp14">
+  <w:p>
+    <w:pPr>
+      <w:pStyle w:val="Footer"/>
+    </w:pPr>
+  </w:p>
+</w:ftr>
+</file>
+
+<file path=word/footer2.xml><?xml version="1.0" encoding="utf-8"?>
+<w:ftr xmlns:wpc="http://schemas.microsoft.com/office/word/2010/wordprocessingCanvas" xmlns:cx="http://schemas.microsoft.com/office/drawing/2014/chartex" xmlns:cx1="http://schemas.microsoft.com/office/drawing/2015/9/8/chartex" xmlns:cx2="http://schemas.microsoft.com/office/drawing/2015/10/21/chartex" xmlns:cx3="http://schemas.microsoft.com/office/drawing/2016/5/9/chartex" xmlns:cx4="http://schemas.microsoft.com/office/drawing/2016/5/10/chartex" xmlns:cx5="http://schemas.microsoft.com/office/drawing/2016/5/11/chartex" xmlns:cx6="http://schemas.microsoft.com/office/drawing/2016/5/12/chartex" xmlns:cx7="http://schemas.microsoft.com/office/drawing/2016/5/13/chartex" xmlns:cx8="http://schemas.microsoft.com/office/drawing/2016/5/14/chartex" xmlns:mc="http://schemas.openxmlformats.org/markup-compatibility/2006" xmlns:aink="http://schemas.microsoft.com/office/drawing/2016/ink" xmlns:am3d="http://schemas.microsoft.com/office/drawing/2017/model3d" xmlns:o="urn:schemas-microsoft-com:office:office" xmlns:r="http://schemas.openxmlformats.org/officeDocument/2006/relationships" xmlns:m="http://schemas.openxmlformats.org/officeDocument/2006/math" xmlns:v="urn:schemas-microsoft-com:vml" xmlns:wp14="http://schemas.microsoft.com/office/word/2010/wordprocessingDrawing" xmlns:wp="http://schemas.openxmlformats.org/drawingml/2006/wordprocessingDrawing" xmlns:w10="urn:schemas-microsoft-com:office:word" xmlns:w="http://schemas.openxmlformats.org/wordprocessingml/2006/main" xmlns:w14="http://schemas.microsoft.com/office/word/2010/wordml" xmlns:w15="http://schemas.microsoft.com/office/word/2012/wordml" xmlns:w16cex="http://schemas.microsoft.com/office/word/2018/wordml/cex" xmlns:w16cid="http://schemas.microsoft.com/office/word/2016/wordml/cid" xmlns:w16="http://schemas.microsoft.com/office/word/2018/wordml" xmlns:w16sdtdh="http://schemas.microsoft.com/office/word/2020/wordml/sdtdatahash" xmlns:w16se="http://schemas.microsoft.com/office/word/2015/wordml/symex" xmlns:wpg="http://schemas.microsoft.com/office/word/2010/wordprocessingGroup" xmlns:wpi="http://schemas.microsoft.com/office/word/2010/wordprocessingInk" xmlns:wne="http://schemas.microsoft.com/office/word/2006/wordml" xmlns:wps="http://schemas.microsoft.com/office/word/2010/wordprocessingShape" mc:Ignorable="w14 w15 w16se w16cid w16 w16cex w16sdtdh wp14">
   <w:sdt>
     <w:sdtPr>
-      <w:id w:val="-2065783787"/>
+      <w:id w:val="1647311531"/>
       <w:docPartObj>
         <w:docPartGallery w:val="Page Numbers (Bottom of Page)"/>
         <w:docPartUnique/>
@@ -2475,97 +2166,58 @@
     <w:sdtContent>
       <w:p>
         <w:pPr>
-          <w:pStyle w:val="Footer"/>
-          <w:jc w:val="right"/>
+          <w:spacing w:before="120"/>
+          <w:jc w:val="center"/>
+          <w:rPr>
+            <w:rFonts w:ascii="Tahoma" w:hAnsi="Tahoma" w:cs="Tahoma"/>
+            <w:b/>
+            <w:bCs/>
+            <w:sz w:val="16"/>
+            <w:szCs w:val="16"/>
+          </w:rPr>
+        </w:pPr>
+      </w:p>
+      <w:p>
+        <w:pPr>
+          <w:jc w:val="both"/>
+          <w:rPr>
+            <w:rFonts w:ascii="Calibri" w:eastAsia="Times New Roman" w:hAnsi="Calibri" w:cs="Calibri"/>
+            <w:color w:val="000000"/>
+            <w:lang w:val="en-IN" w:eastAsia="en-IN"/>
+          </w:rPr>
         </w:pPr>
         <w:r>
-          <w:fldChar w:fldCharType="begin"/>
+          <w:tab/>
         </w:r>
         <w:r>
-          <w:instrText xml:space="preserve"> PAGE   \* MERGEFORMAT </w:instrText>
+          <w:t xml:space="preserve">                                  </w:t>
         </w:r>
         <w:r>
-          <w:fldChar w:fldCharType="separate"/>
+          <w:t xml:space="preserve">  </w:t>
         </w:r>
         <w:r>
-          <w:rPr>
-            <w:noProof/>
-          </w:rPr>
-          <w:t>1</w:t>
+          <w:t xml:space="preserve">   </w:t>
         </w:r>
         <w:r>
-          <w:rPr>
-            <w:noProof/>
-          </w:rPr>
-          <w:fldChar w:fldCharType="end"/>
+          <w:tab/>
         </w:r>
       </w:p>
     </w:sdtContent>
   </w:sdt>
   <w:p>
     <w:pPr>
+      <w:jc w:val="center"/>
+    </w:pPr>
+  </w:p>
+</w:ftr>
+</file>
+
+<file path=word/footer3.xml><?xml version="1.0" encoding="utf-8"?>
+<w:ftr xmlns:wpc="http://schemas.microsoft.com/office/word/2010/wordprocessingCanvas" xmlns:cx="http://schemas.microsoft.com/office/drawing/2014/chartex" xmlns:cx1="http://schemas.microsoft.com/office/drawing/2015/9/8/chartex" xmlns:cx2="http://schemas.microsoft.com/office/drawing/2015/10/21/chartex" xmlns:cx3="http://schemas.microsoft.com/office/drawing/2016/5/9/chartex" xmlns:cx4="http://schemas.microsoft.com/office/drawing/2016/5/10/chartex" xmlns:cx5="http://schemas.microsoft.com/office/drawing/2016/5/11/chartex" xmlns:cx6="http://schemas.microsoft.com/office/drawing/2016/5/12/chartex" xmlns:cx7="http://schemas.microsoft.com/office/drawing/2016/5/13/chartex" xmlns:cx8="http://schemas.microsoft.com/office/drawing/2016/5/14/chartex" xmlns:mc="http://schemas.openxmlformats.org/markup-compatibility/2006" xmlns:aink="http://schemas.microsoft.com/office/drawing/2016/ink" xmlns:am3d="http://schemas.microsoft.com/office/drawing/2017/model3d" xmlns:o="urn:schemas-microsoft-com:office:office" xmlns:r="http://schemas.openxmlformats.org/officeDocument/2006/relationships" xmlns:m="http://schemas.openxmlformats.org/officeDocument/2006/math" xmlns:v="urn:schemas-microsoft-com:vml" xmlns:wp14="http://schemas.microsoft.com/office/word/2010/wordprocessingDrawing" xmlns:wp="http://schemas.openxmlformats.org/drawingml/2006/wordprocessingDrawing" xmlns:w10="urn:schemas-microsoft-com:office:word" xmlns:w="http://schemas.openxmlformats.org/wordprocessingml/2006/main" xmlns:w14="http://schemas.microsoft.com/office/word/2010/wordml" xmlns:w15="http://schemas.microsoft.com/office/word/2012/wordml" xmlns:w16cex="http://schemas.microsoft.com/office/word/2018/wordml/cex" xmlns:w16cid="http://schemas.microsoft.com/office/word/2016/wordml/cid" xmlns:w16="http://schemas.microsoft.com/office/word/2018/wordml" xmlns:w16sdtdh="http://schemas.microsoft.com/office/word/2020/wordml/sdtdatahash" xmlns:w16se="http://schemas.microsoft.com/office/word/2015/wordml/symex" xmlns:wpg="http://schemas.microsoft.com/office/word/2010/wordprocessingGroup" xmlns:wpi="http://schemas.microsoft.com/office/word/2010/wordprocessingInk" xmlns:wne="http://schemas.microsoft.com/office/word/2006/wordml" xmlns:wps="http://schemas.microsoft.com/office/word/2010/wordprocessingShape" mc:Ignorable="w14 w15 w16se w16cid w16 w16cex w16sdtdh wp14">
+  <w:p>
+    <w:pPr>
       <w:pStyle w:val="Footer"/>
-      <w:jc w:val="center"/>
-      <w:rPr>
-        <w:rFonts w:ascii="Tahoma" w:hAnsi="Tahoma" w:cs="Tahoma"/>
-        <w:sz w:val="16"/>
-        <w:szCs w:val="16"/>
-      </w:rPr>
     </w:pPr>
-    <w:proofErr w:type="spellStart"/>
-    <w:r>
-      <w:rPr>
-        <w:rFonts w:ascii="Tahoma" w:hAnsi="Tahoma" w:cs="Tahoma"/>
-        <w:sz w:val="16"/>
-        <w:szCs w:val="16"/>
-      </w:rPr>
-      <w:t>Sadma</w:t>
-    </w:r>
-    <w:proofErr w:type="spellEnd"/>
-    <w:r>
-      <w:rPr>
-        <w:rFonts w:ascii="Tahoma" w:hAnsi="Tahoma" w:cs="Tahoma"/>
-        <w:sz w:val="16"/>
-        <w:szCs w:val="16"/>
-      </w:rPr>
-      <w:t xml:space="preserve"> Fashion Wear Ltd </w:t>
-    </w:r>
-    <w:proofErr w:type="spellStart"/>
-    <w:r>
-      <w:rPr>
-        <w:rFonts w:ascii="Tahoma" w:hAnsi="Tahoma" w:cs="Tahoma"/>
-        <w:sz w:val="16"/>
-        <w:szCs w:val="16"/>
-      </w:rPr>
-      <w:t>Mouchak</w:t>
-    </w:r>
-    <w:proofErr w:type="spellEnd"/>
-    <w:r>
-      <w:rPr>
-        <w:rFonts w:ascii="Tahoma" w:hAnsi="Tahoma" w:cs="Tahoma"/>
-        <w:sz w:val="16"/>
-        <w:szCs w:val="16"/>
-      </w:rPr>
-      <w:t xml:space="preserve"> (1751), </w:t>
-    </w:r>
-    <w:proofErr w:type="spellStart"/>
-    <w:r>
-      <w:rPr>
-        <w:rFonts w:ascii="Tahoma" w:hAnsi="Tahoma" w:cs="Tahoma"/>
-        <w:sz w:val="16"/>
-        <w:szCs w:val="16"/>
-      </w:rPr>
-      <w:t>Kaliakair</w:t>
-    </w:r>
-    <w:proofErr w:type="spellEnd"/>
-    <w:r>
-      <w:rPr>
-        <w:rFonts w:ascii="Tahoma" w:hAnsi="Tahoma" w:cs="Tahoma"/>
-        <w:sz w:val="16"/>
-        <w:szCs w:val="16"/>
-      </w:rPr>
-      <w:t>.  Gazipur, Dhaka, Bangladesh.</w:t>
-    </w:r>
   </w:p>
 </w:ftr>
 </file>
@@ -2594,19 +2246,757 @@
   <w:p>
     <w:pPr>
       <w:pStyle w:val="Header"/>
+    </w:pPr>
+  </w:p>
+</w:hdr>
+</file>
+
+<file path=word/header2.xml><?xml version="1.0" encoding="utf-8"?>
+<w:hdr xmlns:wpc="http://schemas.microsoft.com/office/word/2010/wordprocessingCanvas" xmlns:cx="http://schemas.microsoft.com/office/drawing/2014/chartex" xmlns:cx1="http://schemas.microsoft.com/office/drawing/2015/9/8/chartex" xmlns:cx2="http://schemas.microsoft.com/office/drawing/2015/10/21/chartex" xmlns:cx3="http://schemas.microsoft.com/office/drawing/2016/5/9/chartex" xmlns:cx4="http://schemas.microsoft.com/office/drawing/2016/5/10/chartex" xmlns:cx5="http://schemas.microsoft.com/office/drawing/2016/5/11/chartex" xmlns:cx6="http://schemas.microsoft.com/office/drawing/2016/5/12/chartex" xmlns:cx7="http://schemas.microsoft.com/office/drawing/2016/5/13/chartex" xmlns:cx8="http://schemas.microsoft.com/office/drawing/2016/5/14/chartex" xmlns:mc="http://schemas.openxmlformats.org/markup-compatibility/2006" xmlns:aink="http://schemas.microsoft.com/office/drawing/2016/ink" xmlns:am3d="http://schemas.microsoft.com/office/drawing/2017/model3d" xmlns:o="urn:schemas-microsoft-com:office:office" xmlns:r="http://schemas.openxmlformats.org/officeDocument/2006/relationships" xmlns:m="http://schemas.openxmlformats.org/officeDocument/2006/math" xmlns:v="urn:schemas-microsoft-com:vml" xmlns:wp14="http://schemas.microsoft.com/office/word/2010/wordprocessingDrawing" xmlns:wp="http://schemas.openxmlformats.org/drawingml/2006/wordprocessingDrawing" xmlns:w10="urn:schemas-microsoft-com:office:word" xmlns:w="http://schemas.openxmlformats.org/wordprocessingml/2006/main" xmlns:w14="http://schemas.microsoft.com/office/word/2010/wordml" xmlns:w15="http://schemas.microsoft.com/office/word/2012/wordml" xmlns:w16cex="http://schemas.microsoft.com/office/word/2018/wordml/cex" xmlns:w16cid="http://schemas.microsoft.com/office/word/2016/wordml/cid" xmlns:w16="http://schemas.microsoft.com/office/word/2018/wordml" xmlns:w16sdtdh="http://schemas.microsoft.com/office/word/2020/wordml/sdtdatahash" xmlns:w16se="http://schemas.microsoft.com/office/word/2015/wordml/symex" xmlns:wpg="http://schemas.microsoft.com/office/word/2010/wordprocessingGroup" xmlns:wpi="http://schemas.microsoft.com/office/word/2010/wordprocessingInk" xmlns:wne="http://schemas.microsoft.com/office/word/2006/wordml" xmlns:wps="http://schemas.microsoft.com/office/word/2010/wordprocessingShape" mc:Ignorable="w14 w15 w16se w16cid w16 w16cex w16sdtdh wp14">
+  <w:p>
+    <w:pPr>
+      <w:tabs>
+        <w:tab w:val="left" w:pos="960"/>
+      </w:tabs>
       <w:rPr>
         <w:noProof/>
       </w:rPr>
     </w:pPr>
+    <w:r>
+      <w:rPr>
+        <w:noProof/>
+        <w:color w:val="000000" w:themeColor="text1"/>
+      </w:rPr>
+      <mc:AlternateContent>
+        <mc:Choice Requires="wpg">
+          <w:drawing>
+            <wp:anchor distT="0" distB="0" distL="114300" distR="114300" simplePos="0" relativeHeight="251667968" behindDoc="0" locked="0" layoutInCell="1" allowOverlap="1" wp14:anchorId="67C55F82" wp14:editId="21CBBC8F">
+              <wp:simplePos x="0" y="0"/>
+              <wp:positionH relativeFrom="column">
+                <wp:posOffset>-601394</wp:posOffset>
+              </wp:positionH>
+              <wp:positionV relativeFrom="paragraph">
+                <wp:posOffset>-168812</wp:posOffset>
+              </wp:positionV>
+              <wp:extent cx="1878037" cy="900332"/>
+              <wp:effectExtent l="0" t="0" r="0" b="0"/>
+              <wp:wrapNone/>
+              <wp:docPr id="6" name="Group 6"/>
+              <wp:cNvGraphicFramePr/>
+              <a:graphic xmlns:a="http://schemas.openxmlformats.org/drawingml/2006/main">
+                <a:graphicData uri="http://schemas.microsoft.com/office/word/2010/wordprocessingGroup">
+                  <wpg:wgp>
+                    <wpg:cNvGrpSpPr/>
+                    <wpg:grpSpPr>
+                      <a:xfrm>
+                        <a:off x="0" y="0"/>
+                        <a:ext cx="1878037" cy="900332"/>
+                        <a:chOff x="0" y="0"/>
+                        <a:chExt cx="1878037" cy="900332"/>
+                      </a:xfrm>
+                    </wpg:grpSpPr>
+                    <pic:pic xmlns:pic="http://schemas.openxmlformats.org/drawingml/2006/picture">
+                      <pic:nvPicPr>
+                        <pic:cNvPr id="1025" name="Picture2">
+                          <a:extLst>
+                            <a:ext uri="{FF2B5EF4-FFF2-40B4-BE49-F238E27FC236}">
+                              <a16:creationId xmlns:a16="http://schemas.microsoft.com/office/drawing/2014/main" id="{06DB53E5-16AE-4DCE-9E6A-55EA5C3D9BC5}"/>
+                            </a:ext>
+                          </a:extLst>
+                        </pic:cNvPr>
+                        <pic:cNvPicPr>
+                          <a:picLocks noChangeAspect="1"/>
+                        </pic:cNvPicPr>
+                      </pic:nvPicPr>
+                      <pic:blipFill rotWithShape="1">
+                        <a:blip r:embed="rId1">
+                          <a:extLst>
+                            <a:ext uri="{28A0092B-C50C-407E-A947-70E740481C1C}">
+                              <a14:useLocalDpi xmlns:a14="http://schemas.microsoft.com/office/drawing/2010/main" val="0"/>
+                            </a:ext>
+                          </a:extLst>
+                        </a:blip>
+                        <a:srcRect l="14503" t="11166" r="13488" b="24648"/>
+                        <a:stretch/>
+                      </pic:blipFill>
+                      <pic:spPr bwMode="auto">
+                        <a:xfrm>
+                          <a:off x="182880" y="0"/>
+                          <a:ext cx="1381760" cy="759460"/>
+                        </a:xfrm>
+                        <a:prstGeom prst="rect">
+                          <a:avLst/>
+                        </a:prstGeom>
+                        <a:noFill/>
+                        <a:ln>
+                          <a:noFill/>
+                        </a:ln>
+                        <a:extLst>
+                          <a:ext uri="{53640926-AAD7-44D8-BBD7-CCE9431645EC}">
+                            <a14:shadowObscured xmlns:a14="http://schemas.microsoft.com/office/drawing/2010/main"/>
+                          </a:ext>
+                        </a:extLst>
+                      </pic:spPr>
+                    </pic:pic>
+                    <wps:wsp>
+                      <wps:cNvPr id="5" name="Text Box 2"/>
+                      <wps:cNvSpPr txBox="1">
+                        <a:spLocks noChangeArrowheads="1"/>
+                      </wps:cNvSpPr>
+                      <wps:spPr bwMode="auto">
+                        <a:xfrm>
+                          <a:off x="0" y="661181"/>
+                          <a:ext cx="1878037" cy="239151"/>
+                        </a:xfrm>
+                        <a:prstGeom prst="rect">
+                          <a:avLst/>
+                        </a:prstGeom>
+                        <a:noFill/>
+                        <a:ln w="9525">
+                          <a:noFill/>
+                          <a:miter lim="800000"/>
+                          <a:headEnd/>
+                          <a:tailEnd/>
+                        </a:ln>
+                      </wps:spPr>
+                      <wps:txbx>
+                        <w:txbxContent>
+                          <w:p>
+                            <w:pPr>
+                              <w:rPr>
+                                <w:rFonts w:ascii="Tahoma" w:hAnsi="Tahoma" w:cs="Tahoma"/>
+                                <w:sz w:val="16"/>
+                                <w:szCs w:val="16"/>
+                                <w:lang w:val="en-IN"/>
+                              </w:rPr>
+                            </w:pPr>
+                            <w:r>
+                              <w:rPr>
+                                <w:rFonts w:ascii="Tahoma" w:hAnsi="Tahoma" w:cs="Tahoma"/>
+                                <w:sz w:val="16"/>
+                                <w:szCs w:val="16"/>
+                                <w:lang w:val="en-IN"/>
+                              </w:rPr>
+                              <w:t>AUBURN DESIGN PRIVATE LIMITED</w:t>
+                            </w:r>
+                          </w:p>
+                        </w:txbxContent>
+                      </wps:txbx>
+                      <wps:bodyPr rot="0" vert="horz" wrap="square" lIns="91440" tIns="45720" rIns="91440" bIns="45720" anchor="t" anchorCtr="0">
+                        <a:noAutofit/>
+                      </wps:bodyPr>
+                    </wps:wsp>
+                  </wpg:wgp>
+                </a:graphicData>
+              </a:graphic>
+            </wp:anchor>
+          </w:drawing>
+        </mc:Choice>
+        <mc:Fallback>
+          <w:pict>
+            <v:group w14:anchorId="67C55F82" id="Group 6" o:spid="_x0000_s1026" style="position:absolute;margin-left:-47.35pt;margin-top:-13.3pt;width:147.9pt;height:70.9pt;z-index:251667968" coordsize="18780,9003" o:gfxdata="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">
+              <v:shapetype id="_x0000_t75" coordsize="21600,21600" o:spt="75" o:preferrelative="t" path="m@4@5l@4@11@9@11@9@5xe" filled="f" stroked="f">
+                <v:stroke joinstyle="miter"/>
+                <v:formulas>
+                  <v:f eqn="if lineDrawn pixelLineWidth 0"/>
+                  <v:f eqn="sum @0 1 0"/>
+                  <v:f eqn="sum 0 0 @1"/>
+                  <v:f eqn="prod @2 1 2"/>
+                  <v:f eqn="prod @3 21600 pixelWidth"/>
+                  <v:f eqn="prod @3 21600 pixelHeight"/>
+                  <v:f eqn="sum @0 0 1"/>
+                  <v:f eqn="prod @6 1 2"/>
+                  <v:f eqn="prod @7 21600 pixelWidth"/>
+                  <v:f eqn="sum @8 21600 0"/>
+                  <v:f eqn="prod @7 21600 pixelHeight"/>
+                  <v:f eqn="sum @10 21600 0"/>
+                </v:formulas>
+                <v:path o:extrusionok="f" gradientshapeok="t" o:connecttype="rect"/>
+                <o:lock v:ext="edit" aspectratio="t"/>
+              </v:shapetype>
+              <v:shape id="Picture2" o:spid="_x0000_s1027" type="#_x0000_t75" style="position:absolute;left:1828;width:13818;height:7594;visibility:visible;mso-wrap-style:square" o:gfxdata="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">
+                <v:imagedata r:id="rId2" o:title="" croptop="7318f" cropbottom="16153f" cropleft="9505f" cropright="8839f"/>
+              </v:shape>
+              <v:shapetype id="_x0000_t202" coordsize="21600,21600" o:spt="202" path="m,l,21600r21600,l21600,xe">
+                <v:stroke joinstyle="miter"/>
+                <v:path gradientshapeok="t" o:connecttype="rect"/>
+              </v:shapetype>
+              <v:shape id="_x0000_s1028" type="#_x0000_t202" style="position:absolute;top:6611;width:18780;height:2392;visibility:visible;mso-wrap-style:square;v-text-anchor:top" o:gfxdata="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" filled="f" stroked="f">
+                <v:textbox>
+                  <w:txbxContent>
+                    <w:p>
+                      <w:pPr>
+                        <w:rPr>
+                          <w:rFonts w:ascii="Tahoma" w:hAnsi="Tahoma" w:cs="Tahoma"/>
+                          <w:sz w:val="16"/>
+                          <w:szCs w:val="16"/>
+                          <w:lang w:val="en-IN"/>
+                        </w:rPr>
+                      </w:pPr>
+                      <w:r>
+                        <w:rPr>
+                          <w:rFonts w:ascii="Tahoma" w:hAnsi="Tahoma" w:cs="Tahoma"/>
+                          <w:sz w:val="16"/>
+                          <w:szCs w:val="16"/>
+                          <w:lang w:val="en-IN"/>
+                        </w:rPr>
+                        <w:t>AUBURN DESIGN PRIVATE LIMITED</w:t>
+                      </w:r>
+                    </w:p>
+                  </w:txbxContent>
+                </v:textbox>
+              </v:shape>
+            </v:group>
+          </w:pict>
+        </mc:Fallback>
+      </mc:AlternateContent>
+    </w:r>
+    <w:r>
+      <w:rPr>
+        <w:noProof/>
+        <w:color w:val="000000" w:themeColor="text1"/>
+      </w:rPr>
+      <mc:AlternateContent>
+        <mc:Choice Requires="wps">
+          <w:drawing>
+            <wp:anchor distT="0" distB="0" distL="114300" distR="114300" simplePos="0" relativeHeight="251652096" behindDoc="0" locked="0" layoutInCell="1" allowOverlap="1" wp14:anchorId="169FCC47" wp14:editId="0A748563">
+              <wp:simplePos x="0" y="0"/>
+              <wp:positionH relativeFrom="column">
+                <wp:posOffset>8830945</wp:posOffset>
+              </wp:positionH>
+              <wp:positionV relativeFrom="paragraph">
+                <wp:posOffset>9037</wp:posOffset>
+              </wp:positionV>
+              <wp:extent cx="2201594" cy="808892"/>
+              <wp:effectExtent l="0" t="0" r="27305" b="10795"/>
+              <wp:wrapNone/>
+              <wp:docPr id="8" name="Rectangle 8"/>
+              <wp:cNvGraphicFramePr/>
+              <a:graphic xmlns:a="http://schemas.openxmlformats.org/drawingml/2006/main">
+                <a:graphicData uri="http://schemas.microsoft.com/office/word/2010/wordprocessingShape">
+                  <wps:wsp>
+                    <wps:cNvSpPr/>
+                    <wps:spPr>
+                      <a:xfrm>
+                        <a:off x="0" y="0"/>
+                        <a:ext cx="2201594" cy="808892"/>
+                      </a:xfrm>
+                      <a:prstGeom prst="rect">
+                        <a:avLst/>
+                      </a:prstGeom>
+                      <a:ln>
+                        <a:solidFill>
+                          <a:schemeClr val="bg1"/>
+                        </a:solidFill>
+                      </a:ln>
+                    </wps:spPr>
+                    <wps:style>
+                      <a:lnRef idx="2">
+                        <a:schemeClr val="accent5"/>
+                      </a:lnRef>
+                      <a:fillRef idx="1">
+                        <a:schemeClr val="lt1"/>
+                      </a:fillRef>
+                      <a:effectRef idx="0">
+                        <a:schemeClr val="accent5"/>
+                      </a:effectRef>
+                      <a:fontRef idx="minor">
+                        <a:schemeClr val="dk1"/>
+                      </a:fontRef>
+                    </wps:style>
+                    <wps:txbx>
+                      <w:txbxContent>
+                        <w:p>
+                          <w:pPr>
+                            <w:jc w:val="both"/>
+                            <w:rPr>
+                              <w:rFonts w:ascii="Tahoma" w:eastAsia="Times New Roman" w:hAnsi="Tahoma" w:cs="Tahoma"/>
+                              <w:color w:val="000000"/>
+                              <w:sz w:val="16"/>
+                              <w:szCs w:val="16"/>
+                              <w:lang w:val="en-IN" w:eastAsia="en-IN"/>
+                            </w:rPr>
+                          </w:pPr>
+                          <w:bookmarkStart w:id="0" w:name="_Hlk85459252"/>
+                          <w:r>
+                            <w:rPr>
+                              <w:rFonts w:ascii="Tahoma" w:eastAsia="Times New Roman" w:hAnsi="Tahoma" w:cs="Tahoma"/>
+                              <w:color w:val="000000"/>
+                              <w:sz w:val="16"/>
+                              <w:szCs w:val="16"/>
+                              <w:lang w:val="en-IN" w:eastAsia="en-IN"/>
+                            </w:rPr>
+                            <w:t>Plot No 615, on Ranchi Tata Road</w:t>
+                          </w:r>
+                        </w:p>
+                        <w:p>
+                          <w:pPr>
+                            <w:jc w:val="both"/>
+                            <w:rPr>
+                              <w:rFonts w:ascii="Tahoma" w:eastAsia="Times New Roman" w:hAnsi="Tahoma" w:cs="Tahoma"/>
+                              <w:color w:val="000000"/>
+                              <w:sz w:val="16"/>
+                              <w:szCs w:val="16"/>
+                              <w:lang w:val="en-IN" w:eastAsia="en-IN"/>
+                            </w:rPr>
+                          </w:pPr>
+                          <w:proofErr w:type="spellStart"/>
+                          <w:r>
+                            <w:rPr>
+                              <w:rFonts w:ascii="Tahoma" w:eastAsia="Times New Roman" w:hAnsi="Tahoma" w:cs="Tahoma"/>
+                              <w:color w:val="000000"/>
+                              <w:sz w:val="16"/>
+                              <w:szCs w:val="16"/>
+                              <w:lang w:val="en-IN" w:eastAsia="en-IN"/>
+                            </w:rPr>
+                            <w:t>Vill-Panch</w:t>
+                          </w:r>
+                          <w:proofErr w:type="spellEnd"/>
+                          <w:r>
+                            <w:rPr>
+                              <w:rFonts w:ascii="Tahoma" w:eastAsia="Times New Roman" w:hAnsi="Tahoma" w:cs="Tahoma"/>
+                              <w:color w:val="000000"/>
+                              <w:sz w:val="16"/>
+                              <w:szCs w:val="16"/>
+                              <w:lang w:val="en-IN" w:eastAsia="en-IN"/>
+                            </w:rPr>
+                            <w:t xml:space="preserve">, </w:t>
+                          </w:r>
+                          <w:r>
+                            <w:rPr>
+                              <w:rFonts w:ascii="Tahoma" w:eastAsia="Times New Roman" w:hAnsi="Tahoma" w:cs="Tahoma"/>
+                              <w:color w:val="000000"/>
+                              <w:sz w:val="16"/>
+                              <w:szCs w:val="16"/>
+                              <w:lang w:val="en-IN" w:eastAsia="en-IN"/>
+                            </w:rPr>
+                            <w:t>Thana</w:t>
+                          </w:r>
+                          <w:r>
+                            <w:rPr>
+                              <w:rFonts w:ascii="Tahoma" w:eastAsia="Times New Roman" w:hAnsi="Tahoma" w:cs="Tahoma"/>
+                              <w:color w:val="000000"/>
+                              <w:sz w:val="16"/>
+                              <w:szCs w:val="16"/>
+                              <w:lang w:val="en-IN" w:eastAsia="en-IN"/>
+                            </w:rPr>
+                            <w:t>-</w:t>
+                          </w:r>
+                          <w:r>
+                            <w:rPr>
+                              <w:rFonts w:ascii="Tahoma" w:eastAsia="Times New Roman" w:hAnsi="Tahoma" w:cs="Tahoma"/>
+                              <w:color w:val="000000"/>
+                              <w:sz w:val="16"/>
+                              <w:szCs w:val="16"/>
+                              <w:lang w:val="en-IN" w:eastAsia="en-IN"/>
+                            </w:rPr>
+                            <w:t>Bundu</w:t>
+                          </w:r>
+                          <w:r>
+                            <w:rPr>
+                              <w:rFonts w:ascii="Tahoma" w:eastAsia="Times New Roman" w:hAnsi="Tahoma" w:cs="Tahoma"/>
+                              <w:color w:val="000000"/>
+                              <w:sz w:val="16"/>
+                              <w:szCs w:val="16"/>
+                              <w:lang w:val="en-IN" w:eastAsia="en-IN"/>
+                            </w:rPr>
+                            <w:t xml:space="preserve">, </w:t>
+                          </w:r>
+                          <w:r>
+                            <w:rPr>
+                              <w:rFonts w:ascii="Tahoma" w:eastAsia="Times New Roman" w:hAnsi="Tahoma" w:cs="Tahoma"/>
+                              <w:color w:val="000000"/>
+                              <w:sz w:val="16"/>
+                              <w:szCs w:val="16"/>
+                              <w:lang w:val="en-IN" w:eastAsia="en-IN"/>
+                            </w:rPr>
+                            <w:t>Ranchi Jharkhand</w:t>
+                          </w:r>
+                        </w:p>
+                        <w:p>
+                          <w:pPr>
+                            <w:jc w:val="both"/>
+                            <w:rPr>
+                              <w:rFonts w:ascii="Tahoma" w:eastAsia="Times New Roman" w:hAnsi="Tahoma" w:cs="Tahoma"/>
+                              <w:color w:val="000000"/>
+                              <w:sz w:val="16"/>
+                              <w:szCs w:val="16"/>
+                              <w:lang w:val="en-IN" w:eastAsia="en-IN"/>
+                            </w:rPr>
+                          </w:pPr>
+                          <w:r>
+                            <w:rPr>
+                              <w:rFonts w:ascii="Tahoma" w:eastAsia="Times New Roman" w:hAnsi="Tahoma" w:cs="Tahoma"/>
+                              <w:color w:val="000000"/>
+                              <w:sz w:val="16"/>
+                              <w:szCs w:val="16"/>
+                              <w:lang w:val="en-IN" w:eastAsia="en-IN"/>
+                            </w:rPr>
+                            <w:t>PIN CODE- 835204</w:t>
+                          </w:r>
+                        </w:p>
+                        <w:p>
+                          <w:pPr>
+                            <w:shd w:val="clear" w:color="auto" w:fill="FFFFFF"/>
+                            <w:rPr>
+                              <w:rFonts w:ascii="Tahoma" w:eastAsia="Times New Roman" w:hAnsi="Tahoma" w:cs="Tahoma"/>
+                              <w:color w:val="000000"/>
+                              <w:sz w:val="16"/>
+                              <w:szCs w:val="16"/>
+                              <w:lang w:val="en-IN" w:eastAsia="en-IN"/>
+                            </w:rPr>
+                          </w:pPr>
+                          <w:r>
+                            <w:rPr>
+                              <w:rFonts w:ascii="Tahoma" w:eastAsia="Times New Roman" w:hAnsi="Tahoma" w:cs="Tahoma"/>
+                              <w:color w:val="000000"/>
+                              <w:sz w:val="16"/>
+                              <w:szCs w:val="16"/>
+                              <w:lang w:val="en-IN" w:eastAsia="en-IN"/>
+                            </w:rPr>
+                            <w:t>GST: 20AATCA6942P1Z3</w:t>
+                          </w:r>
+                        </w:p>
+                        <w:p>
+                          <w:pPr>
+                            <w:shd w:val="clear" w:color="auto" w:fill="FFFFFF"/>
+                            <w:rPr>
+                              <w:rFonts w:ascii="Tahoma" w:eastAsia="Times New Roman" w:hAnsi="Tahoma" w:cs="Tahoma"/>
+                              <w:color w:val="000000"/>
+                              <w:sz w:val="16"/>
+                              <w:szCs w:val="16"/>
+                              <w:lang w:val="en-IN" w:eastAsia="en-IN"/>
+                            </w:rPr>
+                          </w:pPr>
+                          <w:r>
+                            <w:rPr>
+                              <w:rFonts w:ascii="Tahoma" w:eastAsia="Times New Roman" w:hAnsi="Tahoma" w:cs="Tahoma"/>
+                              <w:color w:val="003366"/>
+                              <w:sz w:val="18"/>
+                              <w:szCs w:val="18"/>
+                            </w:rPr>
+                            <w:t>Website:</w:t>
+                          </w:r>
+                          <w:hyperlink r:id="rId3" w:history="1">
+                            <w:r>
+                              <w:rPr>
+                                <w:rStyle w:val="Hyperlink"/>
+                                <w:rFonts w:ascii="Tahoma" w:eastAsia="Times New Roman" w:hAnsi="Tahoma" w:cs="Tahoma"/>
+                                <w:i/>
+                                <w:iCs/>
+                                <w:sz w:val="18"/>
+                                <w:szCs w:val="18"/>
+                              </w:rPr>
+                              <w:t>www.auburn-design.com</w:t>
+                            </w:r>
+                          </w:hyperlink>
+                          <w:r>
+                            <w:rPr>
+                              <w:rFonts w:ascii="Tahoma" w:eastAsia="Times New Roman" w:hAnsi="Tahoma" w:cs="Tahoma"/>
+                              <w:color w:val="000000"/>
+                              <w:sz w:val="16"/>
+                              <w:szCs w:val="16"/>
+                              <w:lang w:val="en-IN" w:eastAsia="en-IN"/>
+                            </w:rPr>
+                            <w:br/>
+                          </w:r>
+                        </w:p>
+                        <w:bookmarkEnd w:id="0"/>
+                        <w:p>
+                          <w:pPr>
+                            <w:shd w:val="clear" w:color="auto" w:fill="FFFFFF"/>
+                            <w:jc w:val="right"/>
+                            <w:rPr>
+                              <w:rFonts w:ascii="Tahoma" w:eastAsia="Times New Roman" w:hAnsi="Tahoma" w:cs="Tahoma"/>
+                              <w:color w:val="222222"/>
+                              <w:sz w:val="16"/>
+                              <w:szCs w:val="16"/>
+                            </w:rPr>
+                          </w:pPr>
+                        </w:p>
+                        <w:p>
+                          <w:pPr>
+                            <w:jc w:val="right"/>
+                            <w:rPr>
+                              <w:rFonts w:ascii="Tahoma" w:hAnsi="Tahoma" w:cs="Tahoma"/>
+                              <w:sz w:val="16"/>
+                              <w:szCs w:val="16"/>
+                            </w:rPr>
+                          </w:pPr>
+                        </w:p>
+                      </w:txbxContent>
+                    </wps:txbx>
+                    <wps:bodyPr rot="0" spcFirstLastPara="0" vertOverflow="overflow" horzOverflow="overflow" vert="horz" wrap="square" lIns="91440" tIns="45720" rIns="91440" bIns="45720" numCol="1" spcCol="0" rtlCol="0" fromWordArt="0" anchor="ctr" anchorCtr="0" forceAA="0" compatLnSpc="1">
+                      <a:prstTxWarp prst="textNoShape">
+                        <a:avLst/>
+                      </a:prstTxWarp>
+                      <a:noAutofit/>
+                    </wps:bodyPr>
+                  </wps:wsp>
+                </a:graphicData>
+              </a:graphic>
+              <wp14:sizeRelH relativeFrom="margin">
+                <wp14:pctWidth>0</wp14:pctWidth>
+              </wp14:sizeRelH>
+              <wp14:sizeRelV relativeFrom="margin">
+                <wp14:pctHeight>0</wp14:pctHeight>
+              </wp14:sizeRelV>
+            </wp:anchor>
+          </w:drawing>
+        </mc:Choice>
+        <mc:Fallback>
+          <w:pict>
+            <v:rect w14:anchorId="169FCC47" id="Rectangle 8" o:spid="_x0000_s1029" style="position:absolute;margin-left:695.35pt;margin-top:.7pt;width:173.35pt;height:63.7pt;z-index:251652096;visibility:visible;mso-wrap-style:square;mso-width-percent:0;mso-height-percent:0;mso-wrap-distance-left:9pt;mso-wrap-distance-top:0;mso-wrap-distance-right:9pt;mso-wrap-distance-bottom:0;mso-position-horizontal:absolute;mso-position-horizontal-relative:text;mso-position-vertical:absolute;mso-position-vertical-relative:text;mso-width-percent:0;mso-height-percent:0;mso-width-relative:margin;mso-height-relative:margin;v-text-anchor:middle" o:gfxdata="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" fillcolor="white [3201]" strokecolor="white [3212]" strokeweight="1pt">
+              <v:textbox>
+                <w:txbxContent>
+                  <w:p>
+                    <w:pPr>
+                      <w:jc w:val="both"/>
+                      <w:rPr>
+                        <w:rFonts w:ascii="Tahoma" w:eastAsia="Times New Roman" w:hAnsi="Tahoma" w:cs="Tahoma"/>
+                        <w:color w:val="000000"/>
+                        <w:sz w:val="16"/>
+                        <w:szCs w:val="16"/>
+                        <w:lang w:val="en-IN" w:eastAsia="en-IN"/>
+                      </w:rPr>
+                    </w:pPr>
+                    <w:bookmarkStart w:id="1" w:name="_Hlk85459252"/>
+                    <w:r>
+                      <w:rPr>
+                        <w:rFonts w:ascii="Tahoma" w:eastAsia="Times New Roman" w:hAnsi="Tahoma" w:cs="Tahoma"/>
+                        <w:color w:val="000000"/>
+                        <w:sz w:val="16"/>
+                        <w:szCs w:val="16"/>
+                        <w:lang w:val="en-IN" w:eastAsia="en-IN"/>
+                      </w:rPr>
+                      <w:t>Plot No 615, on Ranchi Tata Road</w:t>
+                    </w:r>
+                  </w:p>
+                  <w:p>
+                    <w:pPr>
+                      <w:jc w:val="both"/>
+                      <w:rPr>
+                        <w:rFonts w:ascii="Tahoma" w:eastAsia="Times New Roman" w:hAnsi="Tahoma" w:cs="Tahoma"/>
+                        <w:color w:val="000000"/>
+                        <w:sz w:val="16"/>
+                        <w:szCs w:val="16"/>
+                        <w:lang w:val="en-IN" w:eastAsia="en-IN"/>
+                      </w:rPr>
+                    </w:pPr>
+                    <w:proofErr w:type="spellStart"/>
+                    <w:r>
+                      <w:rPr>
+                        <w:rFonts w:ascii="Tahoma" w:eastAsia="Times New Roman" w:hAnsi="Tahoma" w:cs="Tahoma"/>
+                        <w:color w:val="000000"/>
+                        <w:sz w:val="16"/>
+                        <w:szCs w:val="16"/>
+                        <w:lang w:val="en-IN" w:eastAsia="en-IN"/>
+                      </w:rPr>
+                      <w:t>Vill-Panch</w:t>
+                    </w:r>
+                    <w:proofErr w:type="spellEnd"/>
+                    <w:r>
+                      <w:rPr>
+                        <w:rFonts w:ascii="Tahoma" w:eastAsia="Times New Roman" w:hAnsi="Tahoma" w:cs="Tahoma"/>
+                        <w:color w:val="000000"/>
+                        <w:sz w:val="16"/>
+                        <w:szCs w:val="16"/>
+                        <w:lang w:val="en-IN" w:eastAsia="en-IN"/>
+                      </w:rPr>
+                      <w:t xml:space="preserve">, </w:t>
+                    </w:r>
+                    <w:r>
+                      <w:rPr>
+                        <w:rFonts w:ascii="Tahoma" w:eastAsia="Times New Roman" w:hAnsi="Tahoma" w:cs="Tahoma"/>
+                        <w:color w:val="000000"/>
+                        <w:sz w:val="16"/>
+                        <w:szCs w:val="16"/>
+                        <w:lang w:val="en-IN" w:eastAsia="en-IN"/>
+                      </w:rPr>
+                      <w:t>Thana</w:t>
+                    </w:r>
+                    <w:r>
+                      <w:rPr>
+                        <w:rFonts w:ascii="Tahoma" w:eastAsia="Times New Roman" w:hAnsi="Tahoma" w:cs="Tahoma"/>
+                        <w:color w:val="000000"/>
+                        <w:sz w:val="16"/>
+                        <w:szCs w:val="16"/>
+                        <w:lang w:val="en-IN" w:eastAsia="en-IN"/>
+                      </w:rPr>
+                      <w:t>-</w:t>
+                    </w:r>
+                    <w:r>
+                      <w:rPr>
+                        <w:rFonts w:ascii="Tahoma" w:eastAsia="Times New Roman" w:hAnsi="Tahoma" w:cs="Tahoma"/>
+                        <w:color w:val="000000"/>
+                        <w:sz w:val="16"/>
+                        <w:szCs w:val="16"/>
+                        <w:lang w:val="en-IN" w:eastAsia="en-IN"/>
+                      </w:rPr>
+                      <w:t>Bundu</w:t>
+                    </w:r>
+                    <w:r>
+                      <w:rPr>
+                        <w:rFonts w:ascii="Tahoma" w:eastAsia="Times New Roman" w:hAnsi="Tahoma" w:cs="Tahoma"/>
+                        <w:color w:val="000000"/>
+                        <w:sz w:val="16"/>
+                        <w:szCs w:val="16"/>
+                        <w:lang w:val="en-IN" w:eastAsia="en-IN"/>
+                      </w:rPr>
+                      <w:t xml:space="preserve">, </w:t>
+                    </w:r>
+                    <w:r>
+                      <w:rPr>
+                        <w:rFonts w:ascii="Tahoma" w:eastAsia="Times New Roman" w:hAnsi="Tahoma" w:cs="Tahoma"/>
+                        <w:color w:val="000000"/>
+                        <w:sz w:val="16"/>
+                        <w:szCs w:val="16"/>
+                        <w:lang w:val="en-IN" w:eastAsia="en-IN"/>
+                      </w:rPr>
+                      <w:t>Ranchi Jharkhand</w:t>
+                    </w:r>
+                  </w:p>
+                  <w:p>
+                    <w:pPr>
+                      <w:jc w:val="both"/>
+                      <w:rPr>
+                        <w:rFonts w:ascii="Tahoma" w:eastAsia="Times New Roman" w:hAnsi="Tahoma" w:cs="Tahoma"/>
+                        <w:color w:val="000000"/>
+                        <w:sz w:val="16"/>
+                        <w:szCs w:val="16"/>
+                        <w:lang w:val="en-IN" w:eastAsia="en-IN"/>
+                      </w:rPr>
+                    </w:pPr>
+                    <w:r>
+                      <w:rPr>
+                        <w:rFonts w:ascii="Tahoma" w:eastAsia="Times New Roman" w:hAnsi="Tahoma" w:cs="Tahoma"/>
+                        <w:color w:val="000000"/>
+                        <w:sz w:val="16"/>
+                        <w:szCs w:val="16"/>
+                        <w:lang w:val="en-IN" w:eastAsia="en-IN"/>
+                      </w:rPr>
+                      <w:t>PIN CODE- 835204</w:t>
+                    </w:r>
+                  </w:p>
+                  <w:p>
+                    <w:pPr>
+                      <w:shd w:val="clear" w:color="auto" w:fill="FFFFFF"/>
+                      <w:rPr>
+                        <w:rFonts w:ascii="Tahoma" w:eastAsia="Times New Roman" w:hAnsi="Tahoma" w:cs="Tahoma"/>
+                        <w:color w:val="000000"/>
+                        <w:sz w:val="16"/>
+                        <w:szCs w:val="16"/>
+                        <w:lang w:val="en-IN" w:eastAsia="en-IN"/>
+                      </w:rPr>
+                    </w:pPr>
+                    <w:r>
+                      <w:rPr>
+                        <w:rFonts w:ascii="Tahoma" w:eastAsia="Times New Roman" w:hAnsi="Tahoma" w:cs="Tahoma"/>
+                        <w:color w:val="000000"/>
+                        <w:sz w:val="16"/>
+                        <w:szCs w:val="16"/>
+                        <w:lang w:val="en-IN" w:eastAsia="en-IN"/>
+                      </w:rPr>
+                      <w:t>GST: 20AATCA6942P1Z3</w:t>
+                    </w:r>
+                  </w:p>
+                  <w:p>
+                    <w:pPr>
+                      <w:shd w:val="clear" w:color="auto" w:fill="FFFFFF"/>
+                      <w:rPr>
+                        <w:rFonts w:ascii="Tahoma" w:eastAsia="Times New Roman" w:hAnsi="Tahoma" w:cs="Tahoma"/>
+                        <w:color w:val="000000"/>
+                        <w:sz w:val="16"/>
+                        <w:szCs w:val="16"/>
+                        <w:lang w:val="en-IN" w:eastAsia="en-IN"/>
+                      </w:rPr>
+                    </w:pPr>
+                    <w:r>
+                      <w:rPr>
+                        <w:rFonts w:ascii="Tahoma" w:eastAsia="Times New Roman" w:hAnsi="Tahoma" w:cs="Tahoma"/>
+                        <w:color w:val="003366"/>
+                        <w:sz w:val="18"/>
+                        <w:szCs w:val="18"/>
+                      </w:rPr>
+                      <w:t>Website:</w:t>
+                    </w:r>
+                    <w:hyperlink r:id="rId4" w:history="1">
+                      <w:r>
+                        <w:rPr>
+                          <w:rStyle w:val="Hyperlink"/>
+                          <w:rFonts w:ascii="Tahoma" w:eastAsia="Times New Roman" w:hAnsi="Tahoma" w:cs="Tahoma"/>
+                          <w:i/>
+                          <w:iCs/>
+                          <w:sz w:val="18"/>
+                          <w:szCs w:val="18"/>
+                        </w:rPr>
+                        <w:t>www.auburn-design.com</w:t>
+                      </w:r>
+                    </w:hyperlink>
+                    <w:r>
+                      <w:rPr>
+                        <w:rFonts w:ascii="Tahoma" w:eastAsia="Times New Roman" w:hAnsi="Tahoma" w:cs="Tahoma"/>
+                        <w:color w:val="000000"/>
+                        <w:sz w:val="16"/>
+                        <w:szCs w:val="16"/>
+                        <w:lang w:val="en-IN" w:eastAsia="en-IN"/>
+                      </w:rPr>
+                      <w:br/>
+                    </w:r>
+                  </w:p>
+                  <w:bookmarkEnd w:id="1"/>
+                  <w:p>
+                    <w:pPr>
+                      <w:shd w:val="clear" w:color="auto" w:fill="FFFFFF"/>
+                      <w:jc w:val="right"/>
+                      <w:rPr>
+                        <w:rFonts w:ascii="Tahoma" w:eastAsia="Times New Roman" w:hAnsi="Tahoma" w:cs="Tahoma"/>
+                        <w:color w:val="222222"/>
+                        <w:sz w:val="16"/>
+                        <w:szCs w:val="16"/>
+                      </w:rPr>
+                    </w:pPr>
+                  </w:p>
+                  <w:p>
+                    <w:pPr>
+                      <w:jc w:val="right"/>
+                      <w:rPr>
+                        <w:rFonts w:ascii="Tahoma" w:hAnsi="Tahoma" w:cs="Tahoma"/>
+                        <w:sz w:val="16"/>
+                        <w:szCs w:val="16"/>
+                      </w:rPr>
+                    </w:pPr>
+                  </w:p>
+                </w:txbxContent>
+              </v:textbox>
+            </v:rect>
+          </w:pict>
+        </mc:Fallback>
+      </mc:AlternateContent>
+    </w:r>
+  </w:p>
+  <w:p>
+    <w:pPr>
+      <w:tabs>
+        <w:tab w:val="left" w:pos="960"/>
+      </w:tabs>
+      <w:ind w:left="-864"/>
+    </w:pPr>
+    <w:r>
+      <w:t xml:space="preserve">   </w:t>
+    </w:r>
+    <w:r>
+      <w:tab/>
+    </w:r>
   </w:p>
   <w:p>
     <w:pPr>
       <w:pStyle w:val="Header"/>
-      <w:ind w:left="-288"/>
+      <w:ind w:left="1152" w:right="-576"/>
     </w:pPr>
     <w:r>
       <w:rPr>
-        <w:rFonts w:ascii="Arial" w:eastAsia="Arial" w:hAnsi="Arial" w:cs="Arial"/>
+        <w:rFonts w:ascii="Arial Narrow" w:eastAsia="Arial" w:hAnsi="Arial Narrow" w:cs="Arial"/>
         <w:b/>
         <w:bCs/>
         <w:noProof/>
@@ -2616,18 +3006,18 @@
       <mc:AlternateContent>
         <mc:Choice Requires="wps">
           <w:drawing>
-            <wp:anchor distT="45720" distB="45720" distL="114300" distR="114300" simplePos="0" relativeHeight="251661312" behindDoc="1" locked="0" layoutInCell="1" allowOverlap="1" wp14:anchorId="0BE73DD0" wp14:editId="72F0E852">
+            <wp:anchor distT="0" distB="0" distL="114300" distR="114300" simplePos="0" relativeHeight="251655168" behindDoc="0" locked="0" layoutInCell="1" allowOverlap="1" wp14:anchorId="6B3E5633" wp14:editId="332DE6CE">
               <wp:simplePos x="0" y="0"/>
-              <wp:positionH relativeFrom="page">
-                <wp:posOffset>10325100</wp:posOffset>
+              <wp:positionH relativeFrom="column">
+                <wp:posOffset>4292600</wp:posOffset>
               </wp:positionH>
               <wp:positionV relativeFrom="paragraph">
-                <wp:posOffset>635</wp:posOffset>
+                <wp:posOffset>12700</wp:posOffset>
               </wp:positionV>
-              <wp:extent cx="1647825" cy="419100"/>
+              <wp:extent cx="1752600" cy="314325"/>
               <wp:effectExtent l="0" t="0" r="0" b="0"/>
               <wp:wrapNone/>
-              <wp:docPr id="11" name="Text Box 2"/>
+              <wp:docPr id="4" name="Text Box 2"/>
               <wp:cNvGraphicFramePr>
                 <a:graphicFrameLocks xmlns:a="http://schemas.openxmlformats.org/drawingml/2006/main"/>
               </wp:cNvGraphicFramePr>
@@ -2640,7 +3030,7 @@
                     <wps:spPr bwMode="auto">
                       <a:xfrm>
                         <a:off x="0" y="0"/>
-                        <a:ext cx="1647825" cy="419100"/>
+                        <a:ext cx="1752600" cy="314325"/>
                       </a:xfrm>
                       <a:prstGeom prst="rect">
                         <a:avLst/>
@@ -2657,92 +3047,24 @@
                       <w:txbxContent>
                         <w:p>
                           <w:pPr>
-                            <w:spacing w:line="278" w:lineRule="auto"/>
-                            <w:ind w:right="40"/>
                             <w:rPr>
-                              <w:rFonts w:ascii="Tahoma" w:eastAsia="Arial" w:hAnsi="Tahoma" w:cs="Tahoma"/>
-                              <w:sz w:val="16"/>
-                              <w:szCs w:val="16"/>
-                            </w:rPr>
-                          </w:pPr>
-                          <w:proofErr w:type="spellStart"/>
-                          <w:r>
-                            <w:rPr>
-                              <w:rFonts w:ascii="Tahoma" w:eastAsia="Arial" w:hAnsi="Tahoma" w:cs="Tahoma"/>
-                              <w:sz w:val="16"/>
-                              <w:szCs w:val="16"/>
-                            </w:rPr>
-                            <w:t>Mouchak</w:t>
-                          </w:r>
-                          <w:proofErr w:type="spellEnd"/>
-                          <w:r>
-                            <w:rPr>
-                              <w:rFonts w:ascii="Tahoma" w:eastAsia="Arial" w:hAnsi="Tahoma" w:cs="Tahoma"/>
-                              <w:sz w:val="16"/>
-                              <w:szCs w:val="16"/>
-                            </w:rPr>
-                            <w:t xml:space="preserve"> (1751), </w:t>
-                          </w:r>
-                          <w:proofErr w:type="spellStart"/>
-                          <w:r>
-                            <w:rPr>
-                              <w:rFonts w:ascii="Tahoma" w:eastAsia="Arial" w:hAnsi="Tahoma" w:cs="Tahoma"/>
-                              <w:sz w:val="16"/>
-                              <w:szCs w:val="16"/>
-                            </w:rPr>
-                            <w:t>Kaliakair</w:t>
-                          </w:r>
-                          <w:proofErr w:type="spellEnd"/>
-                          <w:r>
-                            <w:rPr>
-                              <w:rFonts w:ascii="Tahoma" w:eastAsia="Arial" w:hAnsi="Tahoma" w:cs="Tahoma"/>
-                              <w:sz w:val="16"/>
-                              <w:szCs w:val="16"/>
-                            </w:rPr>
-                            <w:t>.</w:t>
-                          </w:r>
-                        </w:p>
-                        <w:p>
-                          <w:pPr>
-                            <w:spacing w:line="278" w:lineRule="auto"/>
-                            <w:ind w:right="40"/>
-                            <w:rPr>
-                              <w:rFonts w:ascii="Arial" w:eastAsia="Arial" w:hAnsi="Arial" w:cs="Arial"/>
-                              <w:sz w:val="16"/>
-                              <w:szCs w:val="16"/>
+                              <w:rFonts w:ascii="Tahoma" w:hAnsi="Tahoma" w:cs="Tahoma"/>
+                              <w:sz w:val="24"/>
+                              <w:szCs w:val="24"/>
+                              <w:u w:val="single"/>
                             </w:rPr>
                           </w:pPr>
                           <w:r>
                             <w:rPr>
-                              <w:rFonts w:ascii="Tahoma" w:eastAsia="Arial" w:hAnsi="Tahoma" w:cs="Tahoma"/>
-                              <w:sz w:val="16"/>
-                              <w:szCs w:val="16"/>
-                            </w:rPr>
-                            <w:t>Gazipur, Dhaka, Bangladesh.</w:t>
-                          </w:r>
-                        </w:p>
-                        <w:p>
-                          <w:pPr>
-                            <w:spacing w:line="1" w:lineRule="exact"/>
-                            <w:rPr>
+                              <w:rFonts w:ascii="Tahoma" w:hAnsi="Tahoma" w:cs="Tahoma"/>
+                              <w:b/>
+                              <w:bCs/>
                               <w:sz w:val="24"/>
                               <w:szCs w:val="24"/>
+                              <w:u w:val="single"/>
                             </w:rPr>
-                          </w:pPr>
-                        </w:p>
-                        <w:p>
-                          <w:pPr>
-                            <w:spacing w:line="27" w:lineRule="exact"/>
-                            <w:rPr>
-                              <w:sz w:val="24"/>
-                              <w:szCs w:val="24"/>
-                            </w:rPr>
-                          </w:pPr>
-                        </w:p>
-                        <w:p>
-                          <w:pPr>
-                            <w:jc w:val="right"/>
-                          </w:pPr>
+                            <w:t>PURCHASE ORDER</w:t>
+                          </w:r>
                         </w:p>
                       </w:txbxContent>
                     </wps:txbx>
@@ -2763,399 +3085,28 @@
         </mc:Choice>
         <mc:Fallback>
           <w:pict>
-            <v:shapetype w14:anchorId="0BE73DD0" id="_x0000_t202" coordsize="21600,21600" o:spt="202" path="m,l,21600r21600,l21600,xe">
-              <v:stroke joinstyle="miter"/>
-              <v:path gradientshapeok="t" o:connecttype="rect"/>
-            </v:shapetype>
-            <v:shape id="_x0000_s1028" type="#_x0000_t202" style="position:absolute;left:0;text-align:left;margin-left:813pt;margin-top:.05pt;width:129.75pt;height:33pt;z-index:-251655168;visibility:visible;mso-wrap-style:square;mso-width-percent:0;mso-height-percent:0;mso-wrap-distance-left:9pt;mso-wrap-distance-top:3.6pt;mso-wrap-distance-right:9pt;mso-wrap-distance-bottom:3.6pt;mso-position-horizontal:absolute;mso-position-horizontal-relative:page;mso-position-vertical:absolute;mso-position-vertical-relative:text;mso-width-percent:0;mso-height-percent:0;mso-width-relative:margin;mso-height-relative:margin;v-text-anchor:top" o:gfxdata="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" filled="f" stroked="f">
+            <v:shape w14:anchorId="6B3E5633" id="Text Box 2" o:spid="_x0000_s1030" type="#_x0000_t202" style="position:absolute;left:0;text-align:left;margin-left:338pt;margin-top:1pt;width:138pt;height:24.75pt;z-index:251655168;visibility:visible;mso-wrap-style:square;mso-width-percent:0;mso-height-percent:0;mso-wrap-distance-left:9pt;mso-wrap-distance-top:0;mso-wrap-distance-right:9pt;mso-wrap-distance-bottom:0;mso-position-horizontal:absolute;mso-position-horizontal-relative:text;mso-position-vertical:absolute;mso-position-vertical-relative:text;mso-width-percent:0;mso-height-percent:0;mso-width-relative:margin;mso-height-relative:margin;v-text-anchor:top" o:gfxdata="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" filled="f" stroked="f">
               <v:textbox>
                 <w:txbxContent>
                   <w:p>
                     <w:pPr>
-                      <w:spacing w:line="278" w:lineRule="auto"/>
-                      <w:ind w:right="40"/>
                       <w:rPr>
-                        <w:rFonts w:ascii="Tahoma" w:eastAsia="Arial" w:hAnsi="Tahoma" w:cs="Tahoma"/>
-                        <w:sz w:val="16"/>
-                        <w:szCs w:val="16"/>
+                        <w:rFonts w:ascii="Tahoma" w:hAnsi="Tahoma" w:cs="Tahoma"/>
+                        <w:sz w:val="24"/>
+                        <w:szCs w:val="24"/>
+                        <w:u w:val="single"/>
                       </w:rPr>
                     </w:pPr>
-                    <w:proofErr w:type="spellStart"/>
-                    <w:r>
-                      <w:rPr>
-                        <w:rFonts w:ascii="Tahoma" w:eastAsia="Arial" w:hAnsi="Tahoma" w:cs="Tahoma"/>
-                        <w:sz w:val="16"/>
-                        <w:szCs w:val="16"/>
-                      </w:rPr>
-                      <w:t>Mouchak</w:t>
-                    </w:r>
-                    <w:proofErr w:type="spellEnd"/>
-                    <w:r>
-                      <w:rPr>
-                        <w:rFonts w:ascii="Tahoma" w:eastAsia="Arial" w:hAnsi="Tahoma" w:cs="Tahoma"/>
-                        <w:sz w:val="16"/>
-                        <w:szCs w:val="16"/>
-                      </w:rPr>
-                      <w:t xml:space="preserve"> (1751), </w:t>
-                    </w:r>
-                    <w:proofErr w:type="spellStart"/>
-                    <w:r>
-                      <w:rPr>
-                        <w:rFonts w:ascii="Tahoma" w:eastAsia="Arial" w:hAnsi="Tahoma" w:cs="Tahoma"/>
-                        <w:sz w:val="16"/>
-                        <w:szCs w:val="16"/>
-                      </w:rPr>
-                      <w:t>Kaliakair</w:t>
-                    </w:r>
-                    <w:proofErr w:type="spellEnd"/>
-                    <w:r>
-                      <w:rPr>
-                        <w:rFonts w:ascii="Tahoma" w:eastAsia="Arial" w:hAnsi="Tahoma" w:cs="Tahoma"/>
-                        <w:sz w:val="16"/>
-                        <w:szCs w:val="16"/>
-                      </w:rPr>
-                      <w:t>.</w:t>
-                    </w:r>
-                  </w:p>
-                  <w:p>
-                    <w:pPr>
-                      <w:spacing w:line="278" w:lineRule="auto"/>
-                      <w:ind w:right="40"/>
-                      <w:rPr>
-                        <w:rFonts w:ascii="Arial" w:eastAsia="Arial" w:hAnsi="Arial" w:cs="Arial"/>
-                        <w:sz w:val="16"/>
-                        <w:szCs w:val="16"/>
-                      </w:rPr>
-                    </w:pPr>
-                    <w:r>
-                      <w:rPr>
-                        <w:rFonts w:ascii="Tahoma" w:eastAsia="Arial" w:hAnsi="Tahoma" w:cs="Tahoma"/>
-                        <w:sz w:val="16"/>
-                        <w:szCs w:val="16"/>
-                      </w:rPr>
-                      <w:t>Gazipur, Dhaka, Bangladesh.</w:t>
-                    </w:r>
-                  </w:p>
-                  <w:p>
-                    <w:pPr>
-                      <w:spacing w:line="1" w:lineRule="exact"/>
-                      <w:rPr>
-                        <w:sz w:val="24"/>
-                        <w:szCs w:val="24"/>
-                      </w:rPr>
-                    </w:pPr>
-                  </w:p>
-                  <w:p>
-                    <w:pPr>
-                      <w:spacing w:line="27" w:lineRule="exact"/>
-                      <w:rPr>
-                        <w:sz w:val="24"/>
-                        <w:szCs w:val="24"/>
-                      </w:rPr>
-                    </w:pPr>
-                  </w:p>
-                  <w:p>
-                    <w:pPr>
-                      <w:jc w:val="right"/>
-                    </w:pPr>
-                  </w:p>
-                </w:txbxContent>
-              </v:textbox>
-              <w10:wrap anchorx="page"/>
-            </v:shape>
-          </w:pict>
-        </mc:Fallback>
-      </mc:AlternateContent>
-    </w:r>
-    <w:r>
-      <w:rPr>
-        <w:rFonts w:ascii="Arial" w:eastAsia="Arial" w:hAnsi="Arial" w:cs="Arial"/>
-        <w:b/>
-        <w:bCs/>
-        <w:noProof/>
-        <w:sz w:val="23"/>
-        <w:szCs w:val="23"/>
-      </w:rPr>
-      <w:drawing>
-        <wp:inline distT="0" distB="0" distL="0" distR="0" wp14:anchorId="2FC7A593" wp14:editId="16048477">
-          <wp:extent cx="2057400" cy="590550"/>
-          <wp:effectExtent l="0" t="0" r="0" b="0"/>
-          <wp:docPr id="1" name="Picture 1"/>
-          <wp:cNvGraphicFramePr>
-            <a:graphicFrameLocks xmlns:a="http://schemas.openxmlformats.org/drawingml/2006/main" noChangeAspect="1"/>
-          </wp:cNvGraphicFramePr>
-          <a:graphic xmlns:a="http://schemas.openxmlformats.org/drawingml/2006/main">
-            <a:graphicData uri="http://schemas.openxmlformats.org/drawingml/2006/picture">
-              <pic:pic xmlns:pic="http://schemas.openxmlformats.org/drawingml/2006/picture">
-                <pic:nvPicPr>
-                  <pic:cNvPr id="0" name="download.png"/>
-                  <pic:cNvPicPr/>
-                </pic:nvPicPr>
-                <pic:blipFill>
-                  <a:blip r:embed="rId1">
-                    <a:extLst>
-                      <a:ext uri="{28A0092B-C50C-407E-A947-70E740481C1C}">
-                        <a14:useLocalDpi xmlns:a14="http://schemas.microsoft.com/office/drawing/2010/main" val="0"/>
-                      </a:ext>
-                    </a:extLst>
-                  </a:blip>
-                  <a:stretch>
-                    <a:fillRect/>
-                  </a:stretch>
-                </pic:blipFill>
-                <pic:spPr>
-                  <a:xfrm>
-                    <a:off x="0" y="0"/>
-                    <a:ext cx="2057400" cy="590550"/>
-                  </a:xfrm>
-                  <a:prstGeom prst="rect">
-                    <a:avLst/>
-                  </a:prstGeom>
-                </pic:spPr>
-              </pic:pic>
-            </a:graphicData>
-          </a:graphic>
-        </wp:inline>
-      </w:drawing>
-    </w:r>
-    <w:r>
-      <w:t xml:space="preserve">           </w:t>
-    </w:r>
-  </w:p>
-  <w:p>
-    <w:pPr>
-      <w:pStyle w:val="Header"/>
-      <w:tabs>
-        <w:tab w:val="left" w:pos="2265"/>
-        <w:tab w:val="left" w:pos="5400"/>
-        <w:tab w:val="right" w:pos="14220"/>
-      </w:tabs>
-    </w:pPr>
-    <w:r>
-      <w:rPr>
-        <w:rFonts w:ascii="Arial Narrow" w:hAnsi="Arial Narrow" w:cs="Arial"/>
-        <w:noProof/>
-        <w:sz w:val="20"/>
-        <w:szCs w:val="20"/>
-      </w:rPr>
-      <mc:AlternateContent>
-        <mc:Choice Requires="wps">
-          <w:drawing>
-            <wp:anchor distT="0" distB="0" distL="114300" distR="114300" simplePos="0" relativeHeight="251663360" behindDoc="0" locked="0" layoutInCell="1" allowOverlap="1" wp14:anchorId="62B79AEC" wp14:editId="429645D7">
-              <wp:simplePos x="0" y="0"/>
-              <wp:positionH relativeFrom="column">
-                <wp:posOffset>-209550</wp:posOffset>
-              </wp:positionH>
-              <wp:positionV relativeFrom="paragraph">
-                <wp:posOffset>10160</wp:posOffset>
-              </wp:positionV>
-              <wp:extent cx="2298700" cy="238125"/>
-              <wp:effectExtent l="0" t="0" r="0" b="0"/>
-              <wp:wrapNone/>
-              <wp:docPr id="217" name="Text Box 2"/>
-              <wp:cNvGraphicFramePr>
-                <a:graphicFrameLocks xmlns:a="http://schemas.openxmlformats.org/drawingml/2006/main"/>
-              </wp:cNvGraphicFramePr>
-              <a:graphic xmlns:a="http://schemas.openxmlformats.org/drawingml/2006/main">
-                <a:graphicData uri="http://schemas.microsoft.com/office/word/2010/wordprocessingShape">
-                  <wps:wsp>
-                    <wps:cNvSpPr txBox="1">
-                      <a:spLocks noChangeArrowheads="1"/>
-                    </wps:cNvSpPr>
-                    <wps:spPr bwMode="auto">
-                      <a:xfrm>
-                        <a:off x="0" y="0"/>
-                        <a:ext cx="2298700" cy="238125"/>
-                      </a:xfrm>
-                      <a:prstGeom prst="rect">
-                        <a:avLst/>
-                      </a:prstGeom>
-                      <a:noFill/>
-                      <a:ln w="9525">
-                        <a:noFill/>
-                        <a:miter lim="800000"/>
-                        <a:headEnd/>
-                        <a:tailEnd/>
-                      </a:ln>
-                    </wps:spPr>
-                    <wps:txbx>
-                      <w:txbxContent>
-                        <w:p>
-                          <w:pPr>
-                            <w:spacing w:line="278" w:lineRule="auto"/>
-                            <w:ind w:right="40"/>
-                            <w:jc w:val="both"/>
-                            <w:rPr>
-                              <w:rFonts w:ascii="Tahoma" w:eastAsia="Arial" w:hAnsi="Tahoma" w:cs="Tahoma"/>
-                              <w:b/>
-                              <w:sz w:val="16"/>
-                              <w:szCs w:val="16"/>
-                            </w:rPr>
-                          </w:pPr>
-                          <w:proofErr w:type="spellStart"/>
-                          <w:r>
-                            <w:rPr>
-                              <w:rFonts w:ascii="Tahoma" w:eastAsia="Arial" w:hAnsi="Tahoma" w:cs="Tahoma"/>
-                              <w:b/>
-                              <w:sz w:val="16"/>
-                              <w:szCs w:val="16"/>
-                            </w:rPr>
-                            <w:t>Sadma</w:t>
-                          </w:r>
-                          <w:proofErr w:type="spellEnd"/>
-                          <w:r>
-                            <w:rPr>
-                              <w:rFonts w:ascii="Tahoma" w:eastAsia="Arial" w:hAnsi="Tahoma" w:cs="Tahoma"/>
-                              <w:b/>
-                              <w:sz w:val="16"/>
-                              <w:szCs w:val="16"/>
-                            </w:rPr>
-                            <w:t xml:space="preserve"> </w:t>
-                          </w:r>
-                          <w:r>
-                            <w:rPr>
-                              <w:rFonts w:ascii="Tahoma" w:hAnsi="Tahoma" w:cs="Tahoma"/>
-                              <w:b/>
-                              <w:bCs/>
-                              <w:sz w:val="16"/>
-                              <w:szCs w:val="16"/>
-                            </w:rPr>
-                            <w:t>(</w:t>
-                          </w:r>
-                          <w:proofErr w:type="spellStart"/>
-                          <w:r>
-                            <w:rPr>
-                              <w:rFonts w:ascii="Tahoma" w:eastAsia="Arial" w:hAnsi="Tahoma" w:cs="Tahoma"/>
-                              <w:b/>
-                              <w:sz w:val="16"/>
-                              <w:szCs w:val="16"/>
-                            </w:rPr>
-                            <w:t>Sadma</w:t>
-                          </w:r>
-                          <w:proofErr w:type="spellEnd"/>
-                          <w:r>
-                            <w:rPr>
-                              <w:rFonts w:ascii="Tahoma" w:eastAsia="Arial" w:hAnsi="Tahoma" w:cs="Tahoma"/>
-                              <w:b/>
-                              <w:sz w:val="16"/>
-                              <w:szCs w:val="16"/>
-                            </w:rPr>
-                            <w:t xml:space="preserve"> Fashion Wear Ltd)</w:t>
-                          </w:r>
-                        </w:p>
-                        <w:p>
-                          <w:pPr>
-                            <w:rPr>
-                              <w:sz w:val="20"/>
-                              <w:szCs w:val="20"/>
-                            </w:rPr>
-                          </w:pPr>
-                          <w:r>
-                            <w:rPr>
-                              <w:rFonts w:ascii="Arial,Bold" w:hAnsi="Arial,Bold" w:cs="Arial,Bold"/>
-                              <w:b/>
-                              <w:bCs/>
-                              <w:sz w:val="20"/>
-                              <w:szCs w:val="20"/>
-                            </w:rPr>
-                            <w:t>)</w:t>
-                          </w:r>
-                        </w:p>
-                      </w:txbxContent>
-                    </wps:txbx>
-                    <wps:bodyPr rot="0" vert="horz" wrap="square" lIns="91440" tIns="45720" rIns="91440" bIns="45720" anchor="t" anchorCtr="0">
-                      <a:noAutofit/>
-                    </wps:bodyPr>
-                  </wps:wsp>
-                </a:graphicData>
-              </a:graphic>
-            </wp:anchor>
-          </w:drawing>
-        </mc:Choice>
-        <mc:Fallback>
-          <w:pict>
-            <v:shape w14:anchorId="62B79AEC" id="_x0000_s1029" type="#_x0000_t202" style="position:absolute;margin-left:-16.5pt;margin-top:.8pt;width:181pt;height:18.75pt;z-index:251663360;visibility:visible;mso-wrap-style:square;mso-wrap-distance-left:9pt;mso-wrap-distance-top:0;mso-wrap-distance-right:9pt;mso-wrap-distance-bottom:0;mso-position-horizontal:absolute;mso-position-horizontal-relative:text;mso-position-vertical:absolute;mso-position-vertical-relative:text;v-text-anchor:top" o:gfxdata="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" filled="f" stroked="f">
-              <v:textbox>
-                <w:txbxContent>
-                  <w:p>
-                    <w:pPr>
-                      <w:spacing w:line="278" w:lineRule="auto"/>
-                      <w:ind w:right="40"/>
-                      <w:jc w:val="both"/>
-                      <w:rPr>
-                        <w:rFonts w:ascii="Tahoma" w:eastAsia="Arial" w:hAnsi="Tahoma" w:cs="Tahoma"/>
-                        <w:b/>
-                        <w:sz w:val="16"/>
-                        <w:szCs w:val="16"/>
-                      </w:rPr>
-                    </w:pPr>
-                    <w:proofErr w:type="spellStart"/>
-                    <w:r>
-                      <w:rPr>
-                        <w:rFonts w:ascii="Tahoma" w:eastAsia="Arial" w:hAnsi="Tahoma" w:cs="Tahoma"/>
-                        <w:b/>
-                        <w:sz w:val="16"/>
-                        <w:szCs w:val="16"/>
-                      </w:rPr>
-                      <w:t>Sadma</w:t>
-                    </w:r>
-                    <w:proofErr w:type="spellEnd"/>
-                    <w:r>
-                      <w:rPr>
-                        <w:rFonts w:ascii="Tahoma" w:eastAsia="Arial" w:hAnsi="Tahoma" w:cs="Tahoma"/>
-                        <w:b/>
-                        <w:sz w:val="16"/>
-                        <w:szCs w:val="16"/>
-                      </w:rPr>
-                      <w:t xml:space="preserve"> </w:t>
-                    </w:r>
                     <w:r>
                       <w:rPr>
                         <w:rFonts w:ascii="Tahoma" w:hAnsi="Tahoma" w:cs="Tahoma"/>
                         <w:b/>
                         <w:bCs/>
-                        <w:sz w:val="16"/>
-                        <w:szCs w:val="16"/>
+                        <w:sz w:val="24"/>
+                        <w:szCs w:val="24"/>
+                        <w:u w:val="single"/>
                       </w:rPr>
-                      <w:t>(</w:t>
-                    </w:r>
-                    <w:proofErr w:type="spellStart"/>
-                    <w:r>
-                      <w:rPr>
-                        <w:rFonts w:ascii="Tahoma" w:eastAsia="Arial" w:hAnsi="Tahoma" w:cs="Tahoma"/>
-                        <w:b/>
-                        <w:sz w:val="16"/>
-                        <w:szCs w:val="16"/>
-                      </w:rPr>
-                      <w:t>Sadma</w:t>
-                    </w:r>
-                    <w:proofErr w:type="spellEnd"/>
-                    <w:r>
-                      <w:rPr>
-                        <w:rFonts w:ascii="Tahoma" w:eastAsia="Arial" w:hAnsi="Tahoma" w:cs="Tahoma"/>
-                        <w:b/>
-                        <w:sz w:val="16"/>
-                        <w:szCs w:val="16"/>
-                      </w:rPr>
-                      <w:t xml:space="preserve"> Fashion Wear Ltd)</w:t>
-                    </w:r>
-                  </w:p>
-                  <w:p>
-                    <w:pPr>
-                      <w:rPr>
-                        <w:sz w:val="20"/>
-                        <w:szCs w:val="20"/>
-                      </w:rPr>
-                    </w:pPr>
-                    <w:r>
-                      <w:rPr>
-                        <w:rFonts w:ascii="Arial,Bold" w:hAnsi="Arial,Bold" w:cs="Arial,Bold"/>
-                        <w:b/>
-                        <w:bCs/>
-                        <w:sz w:val="20"/>
-                        <w:szCs w:val="20"/>
-                      </w:rPr>
-                      <w:t>)</w:t>
+                      <w:t>PURCHASE ORDER</w:t>
                     </w:r>
                   </w:p>
                 </w:txbxContent>
@@ -3165,34 +3116,16 @@
         </mc:Fallback>
       </mc:AlternateContent>
     </w:r>
-    <w:r>
-      <w:tab/>
-    </w:r>
-    <w:r>
-      <w:tab/>
-    </w:r>
-    <w:r>
-      <w:tab/>
-    </w:r>
   </w:p>
+</w:hdr>
+</file>
+
+<file path=word/header3.xml><?xml version="1.0" encoding="utf-8"?>
+<w:hdr xmlns:wpc="http://schemas.microsoft.com/office/word/2010/wordprocessingCanvas" xmlns:cx="http://schemas.microsoft.com/office/drawing/2014/chartex" xmlns:cx1="http://schemas.microsoft.com/office/drawing/2015/9/8/chartex" xmlns:cx2="http://schemas.microsoft.com/office/drawing/2015/10/21/chartex" xmlns:cx3="http://schemas.microsoft.com/office/drawing/2016/5/9/chartex" xmlns:cx4="http://schemas.microsoft.com/office/drawing/2016/5/10/chartex" xmlns:cx5="http://schemas.microsoft.com/office/drawing/2016/5/11/chartex" xmlns:cx6="http://schemas.microsoft.com/office/drawing/2016/5/12/chartex" xmlns:cx7="http://schemas.microsoft.com/office/drawing/2016/5/13/chartex" xmlns:cx8="http://schemas.microsoft.com/office/drawing/2016/5/14/chartex" xmlns:mc="http://schemas.openxmlformats.org/markup-compatibility/2006" xmlns:aink="http://schemas.microsoft.com/office/drawing/2016/ink" xmlns:am3d="http://schemas.microsoft.com/office/drawing/2017/model3d" xmlns:o="urn:schemas-microsoft-com:office:office" xmlns:r="http://schemas.openxmlformats.org/officeDocument/2006/relationships" xmlns:m="http://schemas.openxmlformats.org/officeDocument/2006/math" xmlns:v="urn:schemas-microsoft-com:vml" xmlns:wp14="http://schemas.microsoft.com/office/word/2010/wordprocessingDrawing" xmlns:wp="http://schemas.openxmlformats.org/drawingml/2006/wordprocessingDrawing" xmlns:w10="urn:schemas-microsoft-com:office:word" xmlns:w="http://schemas.openxmlformats.org/wordprocessingml/2006/main" xmlns:w14="http://schemas.microsoft.com/office/word/2010/wordml" xmlns:w15="http://schemas.microsoft.com/office/word/2012/wordml" xmlns:w16cex="http://schemas.microsoft.com/office/word/2018/wordml/cex" xmlns:w16cid="http://schemas.microsoft.com/office/word/2016/wordml/cid" xmlns:w16="http://schemas.microsoft.com/office/word/2018/wordml" xmlns:w16sdtdh="http://schemas.microsoft.com/office/word/2020/wordml/sdtdatahash" xmlns:w16se="http://schemas.microsoft.com/office/word/2015/wordml/symex" xmlns:wpg="http://schemas.microsoft.com/office/word/2010/wordprocessingGroup" xmlns:wpi="http://schemas.microsoft.com/office/word/2010/wordprocessingInk" xmlns:wne="http://schemas.microsoft.com/office/word/2006/wordml" xmlns:wps="http://schemas.microsoft.com/office/word/2010/wordprocessingShape" mc:Ignorable="w14 w15 w16se w16cid w16 w16cex w16sdtdh wp14">
   <w:p>
     <w:pPr>
       <w:pStyle w:val="Header"/>
-      <w:tabs>
-        <w:tab w:val="left" w:pos="2265"/>
-        <w:tab w:val="left" w:pos="5400"/>
-        <w:tab w:val="right" w:pos="14220"/>
-      </w:tabs>
     </w:pPr>
-    <w:r>
-      <w:tab/>
-    </w:r>
-    <w:r>
-      <w:t xml:space="preserve">          </w:t>
-    </w:r>
-    <w:r>
-      <w:tab/>
-    </w:r>
   </w:p>
 </w:hdr>
 </file>
@@ -3624,7 +3557,7 @@
     <w:lsdException w:name="Table Web 2" w:semiHidden="1" w:unhideWhenUsed="1"/>
     <w:lsdException w:name="Table Web 3" w:semiHidden="1" w:unhideWhenUsed="1"/>
     <w:lsdException w:name="Balloon Text" w:semiHidden="1" w:unhideWhenUsed="1"/>
-    <w:lsdException w:name="Table Grid" w:semiHidden="1" w:uiPriority="39" w:unhideWhenUsed="1"/>
+    <w:lsdException w:name="Table Grid" w:uiPriority="39"/>
     <w:lsdException w:name="Table Theme" w:semiHidden="1" w:unhideWhenUsed="1"/>
     <w:lsdException w:name="Placeholder Text" w:semiHidden="1"/>
     <w:lsdException w:name="No Spacing" w:uiPriority="1" w:qFormat="1"/>
@@ -3850,6 +3783,7 @@
   <w:style w:type="paragraph" w:default="1" w:styleId="Normal">
     <w:name w:val="Normal"/>
     <w:qFormat/>
+    <w:rsid w:val="00637134"/>
   </w:style>
   <w:style w:type="character" w:default="1" w:styleId="DefaultParagraphFont">
     <w:name w:val="Default Paragraph Font"/>
@@ -4038,6 +3972,41 @@
       <w:ind w:left="720"/>
       <w:contextualSpacing/>
     </w:pPr>
+  </w:style>
+  <w:style w:type="character" w:customStyle="1" w:styleId="lrzxr">
+    <w:name w:val="lrzxr"/>
+    <w:basedOn w:val="DefaultParagraphFont"/>
+    <w:rsid w:val="00F509DB"/>
+  </w:style>
+  <w:style w:type="paragraph" w:styleId="Caption">
+    <w:name w:val="caption"/>
+    <w:basedOn w:val="Normal"/>
+    <w:next w:val="Normal"/>
+    <w:uiPriority w:val="35"/>
+    <w:unhideWhenUsed/>
+    <w:qFormat/>
+    <w:rsid w:val="00356ADB"/>
+    <w:pPr>
+      <w:spacing w:after="200"/>
+    </w:pPr>
+    <w:rPr>
+      <w:b/>
+      <w:bCs/>
+      <w:color w:val="4472C4" w:themeColor="accent1"/>
+      <w:sz w:val="18"/>
+      <w:szCs w:val="18"/>
+    </w:rPr>
+  </w:style>
+  <w:style w:type="character" w:styleId="Hyperlink">
+    <w:name w:val="Hyperlink"/>
+    <w:basedOn w:val="DefaultParagraphFont"/>
+    <w:uiPriority w:val="99"/>
+    <w:unhideWhenUsed/>
+    <w:rsid w:val="006A4FA3"/>
+    <w:rPr>
+      <w:color w:val="0563C1" w:themeColor="hyperlink"/>
+      <w:u w:val="single"/>
+    </w:rPr>
   </w:style>
 </w:styles>
 </file>
@@ -4327,7 +4296,53 @@
       </a:bgFillStyleLst>
     </a:fmtScheme>
   </a:themeElements>
-  <a:objectDefaults/>
+  <a:objectDefaults>
+    <a:spDef>
+      <a:spPr>
+        <a:ln>
+          <a:solidFill>
+            <a:schemeClr val="bg1"/>
+          </a:solidFill>
+        </a:ln>
+      </a:spPr>
+      <a:bodyPr rot="0" spcFirstLastPara="0" vertOverflow="overflow" horzOverflow="overflow" vert="horz" wrap="square" lIns="91440" tIns="45720" rIns="91440" bIns="45720" numCol="1" spcCol="0" rtlCol="0" fromWordArt="0" anchor="ctr" anchorCtr="0" forceAA="0" compatLnSpc="1">
+        <a:prstTxWarp prst="textNoShape">
+          <a:avLst/>
+        </a:prstTxWarp>
+        <a:noAutofit/>
+      </a:bodyPr>
+      <a:lstStyle/>
+      <a:style>
+        <a:lnRef idx="2">
+          <a:schemeClr val="accent5"/>
+        </a:lnRef>
+        <a:fillRef idx="1">
+          <a:schemeClr val="lt1"/>
+        </a:fillRef>
+        <a:effectRef idx="0">
+          <a:schemeClr val="accent5"/>
+        </a:effectRef>
+        <a:fontRef idx="minor">
+          <a:schemeClr val="dk1"/>
+        </a:fontRef>
+      </a:style>
+    </a:spDef>
+    <a:txDef>
+      <a:spPr bwMode="auto">
+        <a:noFill/>
+        <a:ln w="9525">
+          <a:noFill/>
+          <a:miter lim="800000"/>
+          <a:headEnd/>
+          <a:tailEnd/>
+        </a:ln>
+      </a:spPr>
+      <a:bodyPr rot="0" vert="horz" wrap="square" lIns="91440" tIns="45720" rIns="91440" bIns="45720" anchor="t" anchorCtr="0">
+        <a:noAutofit/>
+      </a:bodyPr>
+      <a:lstStyle/>
+    </a:txDef>
+  </a:objectDefaults>
   <a:extraClrSchemeLst/>
   <a:extLst>
     <a:ext uri="{05A4C25C-085E-4340-85A3-A5531E510DB2}">
@@ -4342,7 +4357,7 @@
 </file>
 
 <file path=customXml/itemProps1.xml><?xml version="1.0" encoding="utf-8"?>
-<ds:datastoreItem xmlns:ds="http://schemas.openxmlformats.org/officeDocument/2006/customXml" ds:itemID="{6EB783F6-46D2-4A03-BF37-D1E1BC180945}">
+<ds:datastoreItem xmlns:ds="http://schemas.openxmlformats.org/officeDocument/2006/customXml" ds:itemID="{7D958EE9-4952-427D-8713-08F9E51235D3}">
   <ds:schemaRefs>
     <ds:schemaRef ds:uri="http://schemas.openxmlformats.org/officeDocument/2006/bibliography"/>
   </ds:schemaRefs>

</xml_diff>